<commit_message>
Biarkan guru memperbaiki data induk & menyusun soal tanpa keluar halaman
Guru yang mengganti email murid dilaporkan "tersimpan" padahal alamatnya tidak
pernah ditulis, murid baru hanya bisa ditambah dari halaman Murid, mapel baru
memaksa keluar ke halaman Mapel, dan setiap soal dalam satu bab harus memilih
ulang jenis & mapelnya. Kelimanya memperbaiki jalan yang paling sering dipakai
guru, lalu diperiksa di peramban sungguhan: `kelas` 26/26, `murid` 23/23
(termasuk murid masuk dengan alamat email hasil ganti), `slice03` 16/16,
`slice04` 19/19, `pengaturan` 17/17, ditambah `./verify.sh` SEMUA HIJAU.

Sekaligus mencatat putaran A.82 (papan peringkat yang berisi baris sampai ke HP
murid) yang harness-nya sudah dijalankan 62/62 tetapi belum terdokumentasi.

🤖 Generated with Codebuff
Co-Authored-By: Codebuff <noreply@codebuff.com>
</commit_message>
<xml_diff>
--- a/docs/word/penjelasan-fitur.docx
+++ b/docs/word/penjelasan-fitur.docx
@@ -275,32 +275,47 @@
     </w:p>
     <w:p>
       <w:r>
-        <w:t>Catatan tampilan: editor soal memakai tiga kartu bernomor — **1. Tulis soalnya → 2. Pengaturan soal →</w:t>
-      </w:r>
-    </w:p>
-    <w:p>
-      <w:r>
-        <w:t>3. Pilih jenis soal** — dengan daftar periksa **Kelengkapan** di sisi kanan bersama pratinjau (cermin</w:t>
-      </w:r>
-    </w:p>
-    <w:p>
-      <w:r>
-        <w:t>aturan server, jadi tombol simpan baru hidup saat soal benar-benar lengkap). Pemilih jenis berada di</w:t>
-      </w:r>
-    </w:p>
-    <w:p>
-      <w:r>
-        <w:t>**paling bawah** dan bisa dilipat: semua 22 jenis tampil sekaligus sebagai **petak berikon** (ikonnya</w:t>
-      </w:r>
-    </w:p>
-    <w:p>
-      <w:r>
-        <w:t>menggambarkan bentuk soalnya), ringkasannya tetap memperlihatkan jenis yang sedang aktif walau lipatan</w:t>
-      </w:r>
-    </w:p>
-    <w:p>
-      <w:r>
-        <w:t>ditutup, dan menekan satu petak langsung menggantinya tanpa daftar turun. Kuis disusun</w:t>
+        <w:t>Catatan tampilan: editor soal adalah **kartu pertanyaan** — pertanyaan di **paling atas** dengan **Poin**</w:t>
+      </w:r>
+    </w:p>
+    <w:p>
+      <w:r>
+        <w:t>di kanan atasnya, dan jawaban menempel **langsung di bawah pertanyaan**: pilihan ganda tampil sebagai</w:t>
+      </w:r>
+    </w:p>
+    <w:p>
+      <w:r>
+        <w:t>baris penuh dengan **lingkaran kunci di kiri** (sekali klik menandai jawaban benar, ringkasan kunci muncul</w:t>
+      </w:r>
+    </w:p>
+    <w:p>
+      <w:r>
+        <w:t>di bawahnya). **Jenis soal dipilih lebih dulu** di kartu **1. Pilih jenis soal** — semua 22 jenis tampil</w:t>
+      </w:r>
+    </w:p>
+    <w:p>
+      <w:r>
+        <w:t>sekaligus sebagai **petak berikon** (ikonnya menggambarkan bentuk soalnya) yang bisa dilipat, ringkasannya</w:t>
+      </w:r>
+    </w:p>
+    <w:p>
+      <w:r>
+        <w:t>tetap memperlihatkan jenis yang sedang aktif walau lipatan ditutup — lalu **2. Tulis soalnya** dan</w:t>
+      </w:r>
+    </w:p>
+    <w:p>
+      <w:r>
+        <w:t>**3. Pengaturan soal** (mapel, tag, pembahasan, media/MathML, aktif). Daftar periksa **Kelengkapan** di sisi</w:t>
+      </w:r>
+    </w:p>
+    <w:p>
+      <w:r>
+        <w:t>kanan bersama pratinjau (cermin aturan server, jadi tombol simpan baru hidup saat soal benar-benar</w:t>
+      </w:r>
+    </w:p>
+    <w:p>
+      <w:r>
+        <w:t>lengkap). Kuis disusun</w:t>
       </w:r>
     </w:p>
     <w:p>
@@ -483,12 +498,130 @@
         <w:pStyle w:val="Heading3"/>
       </w:pPr>
       <w:r>
-        <w:t>Mengapa aman</w:t>
-      </w:r>
-    </w:p>
-    <w:p>
-      <w:r>
-        <w:t>Semua perhitungan di server; skor asli tidak punya jalur perubahan dari klien. Ranking default-nya mati — guru yang menyalakannya, karena tidak semua kelas senang diperbandingkan.</w:t>
+        <w:t>Peringkat sebagai alat kelas (14 Oktober 2026)</w:t>
+      </w:r>
+    </w:p>
+    <w:p>
+      <w:r>
+        <w:t>Peringkat dipakai guru di depan kelas — bisa ditampilkan besar-besar lewat **mode proyektor** di halaman</w:t>
+      </w:r>
+    </w:p>
+    <w:p>
+      <w:r>
+        <w:t>peringkat. Yang dibuka untuk murid dibatasi dua hal:</w:t>
+      </w:r>
+    </w:p>
+    <w:p>
+      <w:r/>
+    </w:p>
+    <w:p>
+      <w:pPr>
+        <w:pStyle w:val="ListBullet"/>
+      </w:pPr>
+      <w:r>
+        <w:t>**Nomor peringkat hanya untuk N% teratas** (`peringkat_terbuka_persen`, bawaan 30%). Murid lain tetap</w:t>
+      </w:r>
+    </w:p>
+    <w:p>
+      <w:r>
+        <w:t xml:space="preserve">  melihat **skornya sendiri** dan diberi tahu bahwa nomornya belum dibuka — bukan layar kosong. Guru selalu</w:t>
+      </w:r>
+    </w:p>
+    <w:p>
+      <w:r>
+        <w:t xml:space="preserve">  melihat seluruh papan.</w:t>
+      </w:r>
+    </w:p>
+    <w:p>
+      <w:pPr>
+        <w:pStyle w:val="ListBullet"/>
+      </w:pPr>
+      <w:r>
+        <w:t>**Bonus penyemangat** (`bonus_semangat`, bawaan **mati**): murid yang nilainya di bawah ambang</w:t>
+      </w:r>
+    </w:p>
+    <w:p>
+      <w:r>
+        <w:t xml:space="preserve">  (`bonus_semangat_bawah_persen`, bawaan 50%) dinaikkan angka **tampilannya** sampai melewati ambang dan</w:t>
+      </w:r>
+    </w:p>
+    <w:p>
+      <w:r>
+        <w:t xml:space="preserve">  titik tengah kelas, dibatasi `bonus_semangat_maks_persen` (bawaan 15%). Ini **bukan nilai**: yang tercatat</w:t>
+      </w:r>
+    </w:p>
+    <w:p>
+      <w:r>
+        <w:t xml:space="preserve">  di rapor, ekspor nilai, dan laporan tetap skor sebenarnya.</w:t>
+      </w:r>
+    </w:p>
+    <w:p>
+      <w:r/>
+    </w:p>
+    <w:p>
+      <w:r>
+        <w:t>Jejak bonus hanya sampai ke guru: barisnya bertanda "dibantu" lengkap dengan nilai dan peringkat aslinya,</w:t>
+      </w:r>
+    </w:p>
+    <w:p>
+      <w:r>
+        <w:t>sedangkan respons untuk murid sama sekali tidak memuat kunci bonus — dan mode proyektor menyembunyikan</w:t>
+      </w:r>
+    </w:p>
+    <w:p>
+      <w:r>
+        <w:t>kolom itu juga, supaya papan yang menghadap kelas sama persis dengan yang dilihat murid.</w:t>
+      </w:r>
+    </w:p>
+    <w:p>
+      <w:r/>
+    </w:p>
+    <w:p>
+      <w:r>
+        <w:t>Sejak 14 Oktober 2026 papan yang sama bisa juga **dikirim ke HP murid** lewat mode "Papan peringkat" di</w:t>
+      </w:r>
+    </w:p>
+    <w:p>
+      <w:r>
+        <w:t>layar kelas: yang tampil di perangkat anak adalah papan versi murid (nomor hanya N% teratas), bukan papan</w:t>
+      </w:r>
+    </w:p>
+    <w:p>
+      <w:r>
+        <w:t>penuh milik guru — disusun dari komponen dan data yang sama dengan halaman peringkatnya, jadi tidak ada</w:t>
+      </w:r>
+    </w:p>
+    <w:p>
+      <w:r>
+        <w:t>angka yang bisa dibaca berbeda antara HP anak dan papan di kelas.</w:t>
+      </w:r>
+    </w:p>
+    <w:p>
+      <w:r/>
+    </w:p>
+    <w:p>
+      <w:r>
+        <w:t>Di **mode tim** aturannya sama, tetapi yang diperingkat adalah timnya: satu baris per tim berisi nama tim dan</w:t>
+      </w:r>
+    </w:p>
+    <w:p>
+      <w:r>
+        <w:t>anggotanya, dan bahasa di layar anak ikut mengganti kata ("peringkat timmu", "skor timmu", "N tim teratas").</w:t>
+      </w:r>
+    </w:p>
+    <w:p>
+      <w:r>
+        <w:t>**Bonus penyemangat tidak berlaku di papan tim** walau saklarnya menyala: yang tampil adalah nilai kelompok</w:t>
+      </w:r>
+    </w:p>
+    <w:p>
+      <w:r>
+        <w:t>apa adanya, karena menambal angka kelompok bukan menyemangati anak — ia justru menutupi hasil kerja bersama</w:t>
+      </w:r>
+    </w:p>
+    <w:p>
+      <w:r>
+        <w:t>dari guru dan anggotanya sendiri.</w:t>
       </w:r>
     </w:p>
     <w:p>
@@ -499,12 +632,28 @@
         <w:pStyle w:val="Heading3"/>
       </w:pPr>
       <w:r>
+        <w:t>Mengapa aman</w:t>
+      </w:r>
+    </w:p>
+    <w:p>
+      <w:r>
+        <w:t>Semua perhitungan di server; skor asli tidak punya jalur perubahan dari klien. Ranking default-nya mati — guru yang menyalakannya, karena tidak semua kelas senang diperbandingkan. Yang bisa diubah bonus hanyalah angka di papan; nilai resmi tetap jujur.</w:t>
+      </w:r>
+    </w:p>
+    <w:p>
+      <w:r/>
+    </w:p>
+    <w:p>
+      <w:pPr>
+        <w:pStyle w:val="Heading3"/>
+      </w:pPr>
+      <w:r>
         <w:t>Manfaat untuk anak SD dan guru</w:t>
       </w:r>
     </w:p>
     <w:p>
       <w:r>
-        <w:t>Anak SD berani mencoba lagi tanpa takut nilai jeleknya "nempel selamanya", tapi nilai resmi tetap jujur. Guru bisa menyalakan ranking hanya saat cocok, dan remedial jalan sendiri untuk murid yang butuh.</w:t>
+        <w:t>Anak SD berani mencoba lagi tanpa takut nilai jeleknya "nempel selamanya", tapi nilai resmi tetap jujur. Guru bisa menyalakan ranking hanya saat cocok, dan remedial jalan sendiri untuk murid yang butuh. Anak yang selalu di bawah tidak lagi melihat namanya terpaku di dasar papan, sementara gurunya tetap tahu keadaan sebenarnya.</w:t>
       </w:r>
     </w:p>
     <w:p>
@@ -517,7 +666,12 @@
     </w:p>
     <w:p>
       <w:r>
-        <w:t>otomatis tersedia.</w:t>
+        <w:t>otomatis tersedia. Aturan N% teratas dan bonus penyemangat bisa diatur guru per kuis (panel setelan</w:t>
+      </w:r>
+    </w:p>
+    <w:p>
+      <w:r>
+        <w:t>ulangan, kelompok "Tampilan &amp; laporan").</w:t>
       </w:r>
     </w:p>
     <w:p>
@@ -576,17 +730,63 @@
     </w:p>
     <w:p>
       <w:r>
-        <w:t>Lapis sekolah dan kelas menetapkan aturan untuk **seluruh sekolah**, jadi hanya admin yang boleh</w:t>
-      </w:r>
-    </w:p>
-    <w:p>
-      <w:r>
-        <w:t>mengubahnya. Guru mengatur **per kuis miliknya sendiri** — di halaman Pengaturan ia memilih kuisnya,</w:t>
-      </w:r>
-    </w:p>
-    <w:p>
-      <w:r>
-        <w:t>lalu menyalakan proteksi atau aturan yang relevan untuk ulangan itu.</w:t>
+        <w:t>Setelan ulangan **menyatu dengan kuisnya**: guru membuka kuisnya (halaman detail/kelola kuis) dan</w:t>
+      </w:r>
+    </w:p>
+    <w:p>
+      <w:r>
+        <w:t>menyetel proteksi atau aturan di panel **Setelan ulangan** pada halaman itu. Tidak ada lagi daftar</w:t>
+      </w:r>
+    </w:p>
+    <w:p>
+      <w:r>
+        <w:t>ulangan untuk dipilih lebih dulu — jadi tidak ada cara salah memilih ulangan, dan halaman</w:t>
+      </w:r>
+    </w:p>
+    <w:p>
+      <w:r>
+        <w:t>**/pengaturan** kembali ke arti namanya: **akun** (nama, kata sandi, tampilan), bukan aturan ulangan.</w:t>
+      </w:r>
+    </w:p>
+    <w:p>
+      <w:r/>
+    </w:p>
+    <w:p>
+      <w:r>
+        <w:t>Riwayat singkat supaya tidak membingungkan pembaca dokumen lama: sampai 11 Oktober 2026 halaman</w:t>
+      </w:r>
+    </w:p>
+    <w:p>
+      <w:r>
+        <w:t>Pengaturan menawarkan tiga lapis (sekolah/kelas/kuis); 12 Oktober 2026 pemilih lapis sekolah/kelas</w:t>
+      </w:r>
+    </w:p>
+    <w:p>
+      <w:r>
+        <w:t>dibuang; 13 Oktober 2026 pemilih ulangannya juga dibuang karena kuisnya sendiri sudah menjadi</w:t>
+      </w:r>
+    </w:p>
+    <w:p>
+      <w:r>
+        <w:t>konteksnya.</w:t>
+      </w:r>
+    </w:p>
+    <w:p>
+      <w:r/>
+    </w:p>
+    <w:p>
+      <w:r>
+        <w:t>Lapis sekolah dan kelas **tetap berlaku di server** dan tetap bisa mengunci sebuah nilai; panel di</w:t>
+      </w:r>
+    </w:p>
+    <w:p>
+      <w:r>
+        <w:t>halaman kuis hanya menampilkan akibatnya ("dikunci sekolah") tanpa menjadi tempat menyetelnya — jadi</w:t>
+      </w:r>
+    </w:p>
+    <w:p>
+      <w:r>
+        <w:t>tidak ada lagi tombol yang bilangan hasilnya sama untuk semua ulangan.</w:t>
       </w:r>
     </w:p>
     <w:p>
@@ -677,13 +877,100 @@
       <w:r/>
     </w:p>
     <w:p>
-      <w:r>
-        <w:t>Status: **sudah bisa dipakai** (slice 02, diperluas di slice 07; ringkasan sesi + tautan siswa ditambahkan 12 Oktober 2026). Saklar anti-cheat juga memakai mekanisme</w:t>
-      </w:r>
-    </w:p>
-    <w:p>
-      <w:r>
-        <w:t>yang sama, termasuk preset ujian yang bisa dinyalakan sekali klik.</w:t>
+      <w:pPr>
+        <w:pStyle w:val="Heading3"/>
+      </w:pPr>
+      <w:r>
+        <w:t>Saklar yang tidak lari dari jari (14 Oktober 2026)</w:t>
+      </w:r>
+    </w:p>
+    <w:p>
+      <w:r/>
+    </w:p>
+    <w:p>
+      <w:r>
+        <w:t>Di layar sentuh, menyentuh saklar setelan dulu hanya membuat saklarnya **berpindah tempat**: teks keadaannya</w:t>
+      </w:r>
+    </w:p>
+    <w:p>
+      <w:r>
+        <w:t>("Aktif" → "Nonaktif") mengubah panjang label, blok saklarnya bergeser, dan barisnya ikut membungkus ulang —</w:t>
+      </w:r>
+    </w:p>
+    <w:p>
+      <w:r>
+        <w:t>jadi guru menyentuh satu hal dan mengenai hal lain. Sekarang lebarnya tetap dan keterangan "dikunci sekolah"</w:t>
+      </w:r>
+    </w:p>
+    <w:p>
+      <w:r>
+        <w:t>dipindah ke teks sumber di sebelah kiri, sehingga posisi saklar tidak berubah sama sekali saat disentuh</w:t>
+      </w:r>
+    </w:p>
+    <w:p>
+      <w:r>
+        <w:t>(diukur di 390 px: geser 0 px, tinggi baris tetap). Saklar itu juga punya `aria-label` yang menyebut nama</w:t>
+      </w:r>
+    </w:p>
+    <w:p>
+      <w:r>
+        <w:t>setelan dan keadaannya, jadi pembaca layar tidak bergantung pada teks label di sebelahnya.</w:t>
+      </w:r>
+    </w:p>
+    <w:p>
+      <w:r/>
+    </w:p>
+    <w:p>
+      <w:r>
+        <w:t>Satu hal yang **tidak** dilakukan dengan sengaja: setelan ulangan tidak dipasang di layar pengerjaan murid.</w:t>
+      </w:r>
+    </w:p>
+    <w:p>
+      <w:r>
+        <w:t>Layar itu hanya berisi soal, navigator nomor, dan timer; saklar anti-kecurangan/percobaan ulang lengkapnya ada</w:t>
+      </w:r>
+    </w:p>
+    <w:p>
+      <w:r>
+        <w:t>di halaman kuis milik guru. Anak yang sedang ulangan tidak disuguhi saklar yang bukan miliknya — dan itu ikut</w:t>
+      </w:r>
+    </w:p>
+    <w:p>
+      <w:r>
+        <w:t>dijaga pemeriksaan peramban (bukan hanya diandaikan).</w:t>
+      </w:r>
+    </w:p>
+    <w:p>
+      <w:r/>
+    </w:p>
+    <w:p>
+      <w:r>
+        <w:t>Status: **sudah bisa dipakai** (slice 02, diperluas di slice 07; ringkasan sesi + tautan siswa 12 Oktober 2026;</w:t>
+      </w:r>
+    </w:p>
+    <w:p>
+      <w:r>
+        <w:t>panelnya pindah ke halaman kuis 13 Oktober 2026; kerapian saklar di layar sentuh 14 Oktober 2026). Saklar</w:t>
+      </w:r>
+    </w:p>
+    <w:p>
+      <w:r>
+        <w:t>anti-cheat memakai mekanisme yang sama, termasuk preset ujian yang bisa dinyalakan sekali klik. Yang jujur</w:t>
+      </w:r>
+    </w:p>
+    <w:p>
+      <w:r>
+        <w:t>belum ada: lapis sekolah/kelas sekarang **hanya bisa dibaca** lewat panel itu (nilainya diatur dari API/seed</w:t>
+      </w:r>
+    </w:p>
+    <w:p>
+      <w:r>
+        <w:t>dan tetap mengunci), belum ada halaman admin khusus untuknya; kerapian saklar itu diukur di Chrome headless</w:t>
+      </w:r>
+    </w:p>
+    <w:p>
+      <w:r>
+        <w:t>pada lebar ponsel, bukan di perangkat sentuh sungguhan.</w:t>
       </w:r>
     </w:p>
     <w:p>
@@ -742,7 +1029,7 @@
     </w:p>
     <w:p>
       <w:r>
-        <w:t>Sejak 10 Oktober 2026 editor materi bergaya **video editor**: guru memilih rasio bingkai materi (16:9, 9:16, 1:1, atau 4:3), menempatkan tiap klip di track dan detik tertentu, dan mengatur tampilan tiap klip — media: **utuh** di dalam bingkai atau **penuhi bingkai** berikut titik fokus dan zoom; kuis: video **berhenti** sampai kuis dijawab atau tetap berjalan, dengan panel kuis **di bawah video** atau **di sampingnya** — selalu di luar gambar, tidak menutupi yang sedang diputar, dan tingginya tumbuh setinggi isinya (bukan jendela gulir sempit di atas video). Urutan bagian yang dilihat murid mengikuti **timeline** (detik mulai, lalu urutan simpan), bukan urutan klip dibuat. Kuis yang titik mulainya jatuh di dalam sebuah video kini muncul dari **pemutar video itu sendiri**, dan server menolak menutup video selama kuis wajib di dalamnya belum selesai — menarik slider ke ujung tidak mem-bypass urutan wajib. Layar guru (bagian 15) memakai jalur data ringan (SSE) yang sama, tetapi yang disinkronkan adalah **keadaan layar yang dipilih guru** (pengumuman, soal yang disorot, instruksi setelah ulangan) — bukan perpindahan otomatis mengikuti blok materi yang sedang guru buka.</w:t>
+        <w:t>Sejak 10 Oktober 2026 editor materi bergaya **video editor**: guru memilih rasio bingkai materi (16:9, 9:16, 1:1, atau 4:3), menempatkan tiap klip di track dan detik tertentu, dan mengatur tampilan tiap klip — media: **utuh** di dalam bingkai atau **penuhi bingkai** berikut titik fokus dan zoom; kuis: video **berhenti** sampai kuis dijawab atau tetap berjalan, dengan panel kuis **di bawah video** atau **di sampingnya** — selalu di luar gambar, tidak menutupi yang sedang diputar, dan tingginya tumbuh setinggi isinya (bukan jendela gulir sempit di atas video). Urutan bagian yang dilihat murid mengikuti **timeline** (detik mulai, lalu urutan simpan), bukan urutan klip dibuat. Kuis yang titik mulainya jatuh di dalam sebuah video kini muncul dari **pemutar video itu sendiri**, dan server menolak menutup video selama kuis wajib di dalamnya belum selesai — menarik slider ke ujung tidak mem-bypass urutan wajib. Layar guru (bagian 15) memakai jalur data ringan (SSE) yang sama, tetapi yang disinkronkan adalah **keadaan layar yang dipilih guru** (pengumuman, soal yang disorot, papan peringkat, instruksi setelah ulangan) — bukan perpindahan otomatis mengikuti blok materi yang sedang guru buka.</w:t>
       </w:r>
     </w:p>
     <w:p>
@@ -975,7 +1262,7 @@
         <w:pStyle w:val="Heading2"/>
       </w:pPr>
       <w:r>
-        <w:t>7. Anti-kecurangan, presence, dan Live Monitor</w:t>
+        <w:t>7. Anti-kecurangan, presence, dan Monitor Ulangan</w:t>
       </w:r>
     </w:p>
     <w:p>
@@ -1007,7 +1294,7 @@
     </w:p>
     <w:p>
       <w:r>
-        <w:t>Semua penghalang **mati secara bawaan** dan guru yang menyalakan lewat pengaturan. Saat menyala: menempel jawaban dari luar diblok dan dicatat, pindah tab dicatat satu kali per kepergian, buka layar penuh yang keluar diberi peringatan. Semua kejadian hanya **catatan untuk guru** — bukan hukuman otomatis. Presence bekerja hemat data: klien tidak mengirim detak jantung terus-menerus; status dihitung dari aktivitas normal murid, jadi hemat kuota dan ramah sinyal lemah. Di server, kehadiran satu kelas disimpan sebagai satu hash Redis per kuis, sehingga setiap request murid hanya menulis satu medan miliknya sendiri — biayanya tidak tumbuh seiring jumlah anak di kelas, dan dua anak yang menyimpan jawaban bersamaan tidak saling menimpa. Live Monitor menampilkan siapa sedang mengerjakan apa, progres, dan catatan kejadian — mengalir tanpa muat ulang.</w:t>
+        <w:t>Semua penghalang **mati secara bawaan** dan guru yang menyalakan lewat pengaturan. Saat menyala: menempel jawaban dari luar diblok dan dicatat, pindah tab dicatat satu kali per kepergian, buka layar penuh yang keluar diberi peringatan. Semua kejadian hanya **catatan untuk guru** — bukan hukuman otomatis. Presence bekerja hemat data: klien tidak mengirim detak jantung terus-menerus; status dihitung dari aktivitas normal murid, jadi hemat kuota dan ramah sinyal lemah. Di server, kehadiran satu kelas disimpan sebagai satu hash Redis per kuis, sehingga setiap request murid hanya menulis satu medan miliknya sendiri — biayanya tidak tumbuh seiring jumlah anak di kelas, dan dua anak yang menyimpan jawaban bersamaan tidak saling menimpa. Monitor Ulangan (dulu bernama "Live Monitor") menampilkan siapa sedang mengerjakan apa, progres, dan catatan kejadian — mengalir tanpa muat ulang. Nama dan lencana jalur datanya diganti 12 Oktober 2026: layar guru tidak lagi memajang jargon teknis ("Langsung (SSE)" / "Polling 5 detik") karena yang penting bagi guru adalah papan pantauannya, bukan cara datanya datang; koneksi langsungnya tetap bekerja seperti semula.</w:t>
       </w:r>
     </w:p>
     <w:p>
@@ -1055,7 +1342,7 @@
     </w:p>
     <w:p>
       <w:r>
-        <w:t>Sejak putaran **A.54** sisi server ikut membuktikan sensornya **masih hidup**. Selama proteksi menyala, aplikasi di perangkat murid mengirim **denyut** kecil tiap 30 detik yang membawa **nonce** dari server; server merotasi nonce itu setiap kali. Kalau denyutnya berhenti lebih dari ~100 detik padahal ulangannya masih berjalan, server mencatat `tamper_suspected` (skor risiko 9) — muncul di Live Monitor guru sebagai bahan tinjauan. Nonce membuat liveness tidak bisa dipalsukan dengan memutar ulang kiriman lama.</w:t>
+        <w:t>Sejak putaran **A.54** sisi server ikut membuktikan sensornya **masih hidup**. Selama proteksi menyala, aplikasi di perangkat murid mengirim **denyut** kecil tiap 30 detik yang membawa **nonce** dari server; server merotasi nonce itu setiap kali. Kalau denyutnya berhenti lebih dari ~100 detik padahal ulangannya masih berjalan, server mencatat `tamper_suspected` (skor risiko 9) — muncul di Monitor Ulangan guru sebagai bahan tinjauan. Nonce membuat liveness tidak bisa dipalsukan dengan memutar ulang kiriman lama.</w:t>
       </w:r>
     </w:p>
     <w:p>
@@ -1063,7 +1350,7 @@
     </w:p>
     <w:p>
       <w:r>
-        <w:t>Status: **sudah bisa dipakai** (slice 07 + deteksi tamper 2B–2C di A.53 + sisi server 2D di A.54). Semua pengaman mati secara bawaan dan baru bekerja bila guru menyalakannya. Guru bisa meninjau tiap catatan (valid / tidak valid) langsung dari Live Monitor. Yang belum ada dan kami sebutkan apa adanya: **ambang denyut masih nilai tetap** (30 detik / ~100 detik, belum bisa diatur guru — jeda jaringan yang panjang bisa membuat murid jujur tercatat, karena itu catatannya tetap bahan tinjauan, bukan vonis), deteksi keluar layar penuh, dan pemanggilan Zoom/Meet untuk verifikasi — ketiganya ditunda, bukan disembunyikan.</w:t>
+        <w:t>Status: **sudah bisa dipakai** (slice 07 + deteksi tamper 2B–2C di A.53 + sisi server 2D di A.54). Semua pengaman mati secara bawaan dan baru bekerja bila guru menyalakannya. Guru bisa meninjau tiap catatan (valid / tidak valid) langsung dari Monitor Ulangan. Yang belum ada dan kami sebutkan apa adanya: **ambang denyut masih nilai tetap** (30 detik / ~100 detik, belum bisa diatur guru — jeda jaringan yang panjang bisa membuat murid jujur tercatat, karena itu catatannya tetap bahan tinjauan, bukan vonis), deteksi keluar layar penuh, dan pemanggilan Zoom/Meet untuk verifikasi — ketiganya ditunda, bukan disembunyikan.</w:t>
       </w:r>
     </w:p>
     <w:p>
@@ -1871,7 +2158,17 @@
     </w:p>
     <w:p>
       <w:r>
-        <w:t>mengikuti pengaturan perangkat bila belum pernah diubah di aplikasi.</w:t>
+        <w:t>mengikuti pengaturan perangkat bila belum pernah diubah di aplikasi. Sejak 13 Oktober 2026 pilihannya juga</w:t>
+      </w:r>
+    </w:p>
+    <w:p>
+      <w:r>
+        <w:t>ada di halaman **Akun** (bagian 21) supaya tidak perlu mencari tombol di bilah atas bila guru sedang mengatur</w:t>
+      </w:r>
+    </w:p>
+    <w:p>
+      <w:r>
+        <w:t>akunnya.</w:t>
       </w:r>
     </w:p>
     <w:p>
@@ -2067,7 +2364,12 @@
     </w:p>
     <w:p>
       <w:r>
-        <w:t>konten**: pengumuman singkat, satu soal yang sedang dibahas, atau instruksi setelah ulangan selesai.</w:t>
+        <w:t>konten**: pengumuman singkat, satu soal yang sedang dibahas, papan peringkat, atau instruksi setelah</w:t>
+      </w:r>
+    </w:p>
+    <w:p>
+      <w:r>
+        <w:t>ulangan selesai.</w:t>
       </w:r>
     </w:p>
     <w:p>
@@ -2083,7 +2385,7 @@
     </w:p>
     <w:p>
       <w:r>
-        <w:t>Layar kelas punya empat keadaan: **kosong** (perangkat murid kembali ke tampilan ulangan biasa),</w:t>
+        <w:t>Layar kelas punya lima keadaan: **kosong** (perangkat murid kembali ke tampilan ulangan biasa),</w:t>
       </w:r>
     </w:p>
     <w:p>
@@ -2093,12 +2395,17 @@
     </w:p>
     <w:p>
       <w:r>
-        <w:t>murid), dan **instruksi setelah ulangan**. Guru memilih keadaan lewat halaman `Layar kelas` di detail</w:t>
-      </w:r>
-    </w:p>
-    <w:p>
-      <w:r>
-        <w:t>kuis, dan setiap perubahan disiarkan lewat kanal kuis yang sama dengan Live Monitor (Nginx/Redis/pub-sub</w:t>
+        <w:t>murid), **papan peringkat** (14 Oktober 2026), dan **instruksi setelah ulangan**. Guru memilih keadaan</w:t>
+      </w:r>
+    </w:p>
+    <w:p>
+      <w:r>
+        <w:t>lewat halaman `Layar kelas` di detail kuis, dan setiap perubahan disiarkan lewat kanal kuis yang sama</w:t>
+      </w:r>
+    </w:p>
+    <w:p>
+      <w:r>
+        <w:t>dengan Monitor Ulangan (Nginx/Redis/pub-sub</w:t>
       </w:r>
     </w:p>
     <w:p>
@@ -2119,6 +2426,59 @@
     <w:p>
       <w:r>
         <w:t>`versi`, jadi perangkat tahu salinan yang dipegangnya sudah basi.</w:t>
+      </w:r>
+    </w:p>
+    <w:p>
+      <w:r/>
+    </w:p>
+    <w:p>
+      <w:r>
+        <w:t>**Papan peringkat lewat layar kelas (14 Oktober 2026).** Mode ini menjawab permintaan guru: "papan di</w:t>
+      </w:r>
+    </w:p>
+    <w:p>
+      <w:r>
+        <w:t>proyektor tidak terbaca dari HP anak". Yang sampai ke HP murid adalah papan yang **sama persis** dengan</w:t>
+      </w:r>
+    </w:p>
+    <w:p>
+      <w:r>
+        <w:t>papan di halaman peringkatnya sendiri — komponen yang menyusunnya satu (`PapanPeringkat.jsx`), dan</w:t>
+      </w:r>
+    </w:p>
+    <w:p>
+      <w:r>
+        <w:t>datanya diambil perangkat murid dari endpoint peringkat dengan sesinya sendiri. Karena itu batas yang</w:t>
+      </w:r>
+    </w:p>
+    <w:p>
+      <w:r>
+        <w:t>sudah berlaku ikut utuh: **nomor peringkat hanya untuk N% teratas**, murid di bawahnya membaca skornya</w:t>
+      </w:r>
+    </w:p>
+    <w:p>
+      <w:r>
+        <w:t>sendiri, dan **jejak bonus penyemangat tidak ikut** (kolom "Catatan guru" dan kata "dibantu" hanya ada</w:t>
+      </w:r>
+    </w:p>
+    <w:p>
+      <w:r>
+        <w:t>di layar kerja guru). Payload layar kelas untuk mode ini **tidak memuat isi papan** — hanya penanda mode —</w:t>
+      </w:r>
+    </w:p>
+    <w:p>
+      <w:r>
+        <w:t>jadi tidak ada jalur pintas yang bisa membuka apa yang sengaja ditutup dari murid. Kalau ranking sedang</w:t>
+      </w:r>
+    </w:p>
+    <w:p>
+      <w:r>
+        <w:t>dimatikan guru, murid membaca keterangan itu apa adanya, bukan papan kosong; papan juga menyegarkan</w:t>
+      </w:r>
+    </w:p>
+    <w:p>
+      <w:r>
+        <w:t>dirinya sendiri selama tampil (30 detik) dan setiap kali guru menyiarkan ulang.</w:t>
       </w:r>
     </w:p>
     <w:p>
@@ -2198,7 +2558,12 @@
     </w:p>
     <w:p>
       <w:r>
-        <w:t>Status: **kode, test, dan pengujian API selesai** (slice 10). Bawaannya **menyala** (`layar_guru`), dan bisa</w:t>
+        <w:t>Status: **kode, test, dan pengujian API selesai** (slice 10; mode papan peringkat 14 Oktober 2026).</w:t>
+      </w:r>
+    </w:p>
+    <w:p>
+      <w:r>
+        <w:t>Bawaannya **menyala** (`layar_guru`), dan bisa</w:t>
       </w:r>
     </w:p>
     <w:p>
@@ -2218,7 +2583,17 @@
     </w:p>
     <w:p>
       <w:r>
-        <w:t>real-time, dan papan gambar/whiteboard.</w:t>
+        <w:t>real-time, papan gambar/whiteboard, dan **papan peringkat hanya sampai ke murid yang masih berada di layar</w:t>
+      </w:r>
+    </w:p>
+    <w:p>
+      <w:r>
+        <w:t>pengerjaan** — anak yang sudah mengumpulkan dan berpindah ke halaman hasil belum menerimanya (panel layar</w:t>
+      </w:r>
+    </w:p>
+    <w:p>
+      <w:r>
+        <w:t>kelas memang belum dipasang di halaman hasil).</w:t>
       </w:r>
     </w:p>
     <w:p>
@@ -2719,7 +3094,7 @@
     </w:p>
     <w:p>
       <w:r>
-        <w:t>1. Guru menyalakan saklar di **Pengaturan → Siswa tamu** pada lingkup kuis miliknya.</w:t>
+        <w:t>1. Guru menyalakan saklar **Siswa tamu** pada panel *Setelan ulangan* di halaman kuis miliknya.</w:t>
       </w:r>
     </w:p>
     <w:p>
@@ -3102,8 +3477,85 @@
       <w:r/>
     </w:p>
     <w:p>
-      <w:r>
-        <w:t>Status: **sudah bisa dipakai** (putaran A.51 + A.53, diuji 18/18 di Chrome sungguhan). Batasan yang jujur:</w:t>
+      <w:pPr>
+        <w:pStyle w:val="Heading3"/>
+      </w:pPr>
+      <w:r>
+        <w:t>Menambah murid tanpa pindah halaman (14 Oktober 2026)</w:t>
+      </w:r>
+    </w:p>
+    <w:p>
+      <w:r/>
+    </w:p>
+    <w:p>
+      <w:r>
+        <w:t>Kelas dan murid adalah satu pekerjaan yang sama bagi guru: begitu kelasnya jadi, hal berikutnya hampir selalu</w:t>
+      </w:r>
+    </w:p>
+    <w:p>
+      <w:r>
+        <w:t>menambah muridnya. Sejak 14 Oktober 2026 tiap baris di halaman **Kelas** punya tombol **+** yang membuka panel</w:t>
+      </w:r>
+    </w:p>
+    <w:p>
+      <w:r>
+        <w:t>murid baru dengan **kelas itu sudah terpilih** — guru tidak perlu pindah ke halaman Murid lalu memilih lagi</w:t>
+      </w:r>
+    </w:p>
+    <w:p>
+      <w:r>
+        <w:t>kelas yang barusan ia lihat. Panelnya memuat nama, email, dan NIS/NISN (opsional) yang sama seperti halaman</w:t>
+      </w:r>
+    </w:p>
+    <w:p>
+      <w:r>
+        <w:t>Murid, termasuk sebab per kolom bila server menolak (mis. email sudah dipakai). Kode kelas yang dikirim ke</w:t>
+      </w:r>
+    </w:p>
+    <w:p>
+      <w:r>
+        <w:t>server ditentukan barisnya, bukan dipilih ulang, jadi murid tidak bisa mendarat di kelas yang salah.</w:t>
+      </w:r>
+    </w:p>
+    <w:p>
+      <w:r/>
+    </w:p>
+    <w:p>
+      <w:r>
+        <w:t>Di halaman **Murid** sendiri, alamat email murid kini benar-benar bisa **diperbaiki** (14 Oktober 2026): dulu</w:t>
+      </w:r>
+    </w:p>
+    <w:p>
+      <w:r>
+        <w:t>kolom itu lolos validasi tetapi tidak pernah disimpan, sehingga panelnya menjawab "Murid diperbarui."</w:t>
+      </w:r>
+    </w:p>
+    <w:p>
+      <w:r>
+        <w:t>sementara alamatnya tetap yang lama — dan itu baru ketahuan saat murid gagal masuk dengan alamat barunya.</w:t>
+      </w:r>
+    </w:p>
+    <w:p>
+      <w:r>
+        <w:t>Verifikasi emailnya sengaja **tidak** dikosongkan: alamat ini ditetapkan sekolah (bukan pendaftaran sendiri),</w:t>
+      </w:r>
+    </w:p>
+    <w:p>
+      <w:r>
+        <w:t>dan murid tidak bisa membuka tautan verifikasi ke alamat yang baru saja diganti guru.</w:t>
+      </w:r>
+    </w:p>
+    <w:p>
+      <w:r/>
+    </w:p>
+    <w:p>
+      <w:r>
+        <w:t>Status: **sudah bisa dipakai** (putaran A.51 + A.53 + A.83, diuji 18/18 → **23/23** di Chrome sungguhan,</w:t>
+      </w:r>
+    </w:p>
+    <w:p>
+      <w:r>
+        <w:t>termasuk membuktikan murid bisa masuk dengan alamat email hasil ganti). Batasan yang jujur:</w:t>
       </w:r>
     </w:p>
     <w:p>
@@ -3118,7 +3570,629 @@
     </w:p>
     <w:p>
       <w:r>
-        <w:t>uji beban waktu tanggap; dan kotak cari baru ada di halaman **Murid** (Kelas, Mapel, dan Bank Soal belum).</w:t>
+        <w:t>uji beban waktu tanggap. Sejak 13 Oktober 2026 kotak cari juga ada di halaman **Bank Soal** (dan di panel</w:t>
+      </w:r>
+    </w:p>
+    <w:p>
+      <w:r>
+        <w:t>pilih-soal saat menyusun kuis) — keduanya menyaring di server dan memuat hasilnya bertahap; halaman Kelas</w:t>
+      </w:r>
+    </w:p>
+    <w:p>
+      <w:r>
+        <w:t>dan Mapel belum punya kotak cari.</w:t>
+      </w:r>
+    </w:p>
+    <w:p>
+      <w:r/>
+    </w:p>
+    <w:p>
+      <w:r>
+        <w:t>────────────────────────────────────────</w:t>
+      </w:r>
+    </w:p>
+    <w:p>
+      <w:r/>
+    </w:p>
+    <w:p>
+      <w:pPr>
+        <w:pStyle w:val="Heading2"/>
+      </w:pPr>
+      <w:r>
+        <w:t>20. Bank soal yang tidak dimuat sekaligus</w:t>
+      </w:r>
+    </w:p>
+    <w:p>
+      <w:r/>
+    </w:p>
+    <w:p>
+      <w:pPr>
+        <w:pStyle w:val="Heading3"/>
+      </w:pPr>
+      <w:r>
+        <w:t>Apa ini</w:t>
+      </w:r>
+    </w:p>
+    <w:p>
+      <w:r>
+        <w:t>Daftar soal di halaman **Bank Soal** — dan daftar pilih-soal saat guru menyusun kuis — dimuat **20 baris sekali</w:t>
+      </w:r>
+    </w:p>
+    <w:p>
+      <w:r>
+        <w:t>kirim**, dengan tombol *Muat 20 soal berikutnya* di bawah daftar dan kotak **Cari soal** di atasnya.</w:t>
+      </w:r>
+    </w:p>
+    <w:p>
+      <w:r/>
+    </w:p>
+    <w:p>
+      <w:pPr>
+        <w:pStyle w:val="Heading3"/>
+      </w:pPr>
+      <w:r>
+        <w:t>Cara kerjanya</w:t>
+      </w:r>
+    </w:p>
+    <w:p>
+      <w:r>
+        <w:t>Sekolah dengan ratusan soal tidak lagi mengirim seluruh bank dalam satu respons hanya untuk menampilkan dua</w:t>
+      </w:r>
+    </w:p>
+    <w:p>
+      <w:r>
+        <w:t>puluh baris pertama: tiap permintaan membawa `per_page=20` dan halaman yang diminta, lalu baris berikutnya</w:t>
+      </w:r>
+    </w:p>
+    <w:p>
+      <w:r>
+        <w:t>**ditambahkan** ke bawah daftar (bukan menggantikan). Kotak cari mengirim kata kunci ke server sebagai `q`</w:t>
+      </w:r>
+    </w:p>
+    <w:p>
+      <w:r>
+        <w:t>setelah guru berhenti mengetik 300 ms — jadi mencari soal lama tidak berarti membuka halaman satu per satu,</w:t>
+      </w:r>
+    </w:p>
+    <w:p>
+      <w:r>
+        <w:t>dan pencariannya berlaku ke **seluruh** bank soal, bukan hanya baris yang kebetulan tampil. Keadaan kosongnya</w:t>
+      </w:r>
+    </w:p>
+    <w:p>
+      <w:r>
+        <w:t>menyebut kata kuncinya dan menawarkan *Bersihkan pencarian*.</w:t>
+      </w:r>
+    </w:p>
+    <w:p>
+      <w:r/>
+    </w:p>
+    <w:p>
+      <w:r>
+        <w:t>Satu hal yang ikut dijaga: skor dan status aktif soal yang **sudah dipilih** diingat di sisi klien. Tanpa itu,</w:t>
+      </w:r>
+    </w:p>
+    <w:p>
+      <w:r>
+        <w:t>soal pilihan yang tidak ada di halaman yang sedang tampil akan terhitung **0 poin** dan lolos dari pemeriksaan</w:t>
+      </w:r>
+    </w:p>
+    <w:p>
+      <w:r>
+        <w:t>"semua soal yang dipilih aktif" — ringkasan langkah terakhir lalu berkata tidak benar.</w:t>
+      </w:r>
+    </w:p>
+    <w:p>
+      <w:r/>
+    </w:p>
+    <w:p>
+      <w:pPr>
+        <w:pStyle w:val="Heading3"/>
+      </w:pPr>
+      <w:r>
+        <w:t>Manfaat untuk anak SD dan guru</w:t>
+      </w:r>
+    </w:p>
+    <w:p>
+      <w:r>
+        <w:t>Waktu buka halaman Bank Soal dan langkah “Susun soal” tidak lagi tumbuh mengikuti jumlah soal sekolah, dan</w:t>
+      </w:r>
+    </w:p>
+    <w:p>
+      <w:r>
+        <w:t>guru tetap bisa menemukan soal semester lalu tanpa menelusuri halaman.</w:t>
+      </w:r>
+    </w:p>
+    <w:p>
+      <w:r/>
+    </w:p>
+    <w:p>
+      <w:pPr>
+        <w:pStyle w:val="Heading3"/>
+      </w:pPr>
+      <w:r>
+        <w:t>Menulis rangkaian soal tanpa keluar-masuk editor (14 Oktober 2026)</w:t>
+      </w:r>
+    </w:p>
+    <w:p>
+      <w:r/>
+    </w:p>
+    <w:p>
+      <w:r>
+        <w:t>Menyusun satu bab ulangan berarti menulis belasan soal yang **jenis dan mapelnya sama**. Dua jalan pintas</w:t>
+      </w:r>
+    </w:p>
+    <w:p>
+      <w:r>
+        <w:t>menutup pekerjaan berulang itu:</w:t>
+      </w:r>
+    </w:p>
+    <w:p>
+      <w:r/>
+    </w:p>
+    <w:p>
+      <w:r>
+        <w:t>1. **Mapel baru dibuat di dalam editor soal.** Mapel wajib saat menyimpan, jadi sekolah yang belum punya</w:t>
+      </w:r>
+    </w:p>
+    <w:p>
+      <w:r>
+        <w:t xml:space="preserve">   mapel dulu terkunci dari bank soal: satu-satunya jalan membuatnya ada di halaman Mapel, artinya guru harus</w:t>
+      </w:r>
+    </w:p>
+    <w:p>
+      <w:r>
+        <w:t xml:space="preserve">   keluar dari soal yang sedang ditulis. Sekarang tombol *Mapel baru* di sebelah pemilih mapel membuka isian</w:t>
+      </w:r>
+    </w:p>
+    <w:p>
+      <w:r>
+        <w:t xml:space="preserve">   nama (+ kode opsional), dan mapel yang tersimpan **langsung dipakai soal itu** — daftar pemilihnya ikut</w:t>
+      </w:r>
+    </w:p>
+    <w:p>
+      <w:r>
+        <w:t xml:space="preserve">   disegarkan, bukan menunggu muat ulang halaman. Bila sekolah belum punya satu mapel pun, isiannya sudah</w:t>
+      </w:r>
+    </w:p>
+    <w:p>
+      <w:r>
+        <w:t xml:space="preserve">   terbuka sendiri disertai keterangan sebabnya.</w:t>
+      </w:r>
+    </w:p>
+    <w:p>
+      <w:r>
+        <w:t>2. **"Simpan &amp; lanjut".** Satu centang membuat tombol simpan menjadi *Simpan &amp; lanjut*: soalnya tersimpan,</w:t>
+      </w:r>
+    </w:p>
+    <w:p>
+      <w:r>
+        <w:t xml:space="preserve">   lalu editor tetap terbuka untuk soal **berikutnya** dengan jenis, mapel, dan tag yang sama. Yang diwarisi</w:t>
+      </w:r>
+    </w:p>
+    <w:p>
+      <w:r>
+        <w:t xml:space="preserve">   hanya pilihan yang berulang itu — teks soal, pilihan jawaban, dan kuncinya tetap kosong, karena justru itu</w:t>
+      </w:r>
+    </w:p>
+    <w:p>
+      <w:r>
+        <w:t xml:space="preserve">   yang berubah tiap nomor.</w:t>
+      </w:r>
+    </w:p>
+    <w:p>
+      <w:r/>
+    </w:p>
+    <w:p>
+      <w:r>
+        <w:t>Status: **sudah bisa dipakai** (13 Oktober 2026; dua jalan pintas di atas 14 Oktober 2026). Jenis soal di bank</w:t>
+      </w:r>
+    </w:p>
+    <w:p>
+      <w:r>
+        <w:t>soal tetap boleh diperbaiki saat ulangannya berjalan; batas 20 barisnya diatur klien (`PER_HALAMAN`),</w:t>
+      </w:r>
+    </w:p>
+    <w:p>
+      <w:r>
+        <w:t>sedangkan server tetap membatasinya di 100 baris per permintaan. Batasan yang jujur: nama mapel yang sudah</w:t>
+      </w:r>
+    </w:p>
+    <w:p>
+      <w:r>
+        <w:t>dipakai tetap ditolak **server** dan pesannya tampil di panelnya (tidak ada pemeriksaan duplikat di perangkat,</w:t>
+      </w:r>
+    </w:p>
+    <w:p>
+      <w:r>
+        <w:t>karena daftarnya bisa berubah sementara guru mengetik).</w:t>
+      </w:r>
+    </w:p>
+    <w:p>
+      <w:r/>
+    </w:p>
+    <w:p>
+      <w:r>
+        <w:t>────────────────────────────────────────</w:t>
+      </w:r>
+    </w:p>
+    <w:p>
+      <w:r/>
+    </w:p>
+    <w:p>
+      <w:pPr>
+        <w:pStyle w:val="Heading2"/>
+      </w:pPr>
+      <w:r>
+        <w:t>21. Akun sendiri: nama, kata sandi, dan tampilan</w:t>
+      </w:r>
+    </w:p>
+    <w:p>
+      <w:r/>
+    </w:p>
+    <w:p>
+      <w:pPr>
+        <w:pStyle w:val="Heading3"/>
+      </w:pPr>
+      <w:r>
+        <w:t>Apa ini</w:t>
+      </w:r>
+    </w:p>
+    <w:p>
+      <w:r>
+        <w:t>Halaman **/pengaturan** sekarang berisi setelan **akun sendiri**: nama tampilan, kata sandi, tema terang/gelap,</w:t>
+      </w:r>
+    </w:p>
+    <w:p>
+      <w:r>
+        <w:t>dan pintasan ke avatar (khusus murid). Halaman ini milik **semua** pengguna — murid, guru, maupun admin — bukan</w:t>
+      </w:r>
+    </w:p>
+    <w:p>
+      <w:r>
+        <w:t>hanya guru.</w:t>
+      </w:r>
+    </w:p>
+    <w:p>
+      <w:r/>
+    </w:p>
+    <w:p>
+      <w:pPr>
+        <w:pStyle w:val="Heading3"/>
+      </w:pPr>
+      <w:r>
+        <w:t>Cara kerjanya</w:t>
+      </w:r>
+    </w:p>
+    <w:p>
+      <w:pPr>
+        <w:pStyle w:val="ListBullet"/>
+      </w:pPr>
+      <w:r>
+        <w:t>**Nama**: diganti lewat `PUT /v1/akun` dan langsung tampil di kepala aplikasi, laporan, serta daftar nilai.</w:t>
+      </w:r>
+    </w:p>
+    <w:p>
+      <w:pPr>
+        <w:pStyle w:val="ListBullet"/>
+      </w:pPr>
+      <w:r>
+        <w:t>**Email** hanya ditampilkan (tidak bisa diubah): ia alamat verifikasi dan pemulihan akun, jadi perubahannya</w:t>
+      </w:r>
+    </w:p>
+    <w:p>
+      <w:r>
+        <w:t xml:space="preserve">  butuh alur verifikasi tersendiri yang belum ada — server memang menolaknya, bukan sekadar tombolnya dimatikan.</w:t>
+      </w:r>
+    </w:p>
+    <w:p>
+      <w:pPr>
+        <w:pStyle w:val="ListBullet"/>
+      </w:pPr>
+      <w:r>
+        <w:t>**Kata sandi**: wajib menyertakan sandi lama, minimal 10 karakter. Sekali berhasil, `remember_token`</w:t>
+      </w:r>
+    </w:p>
+    <w:p>
+      <w:r>
+        <w:t xml:space="preserve">  diacak ulang dan **sesi di perangkat lain diakhiri** — sedangkan perangkat yang sedang dipakai tetap masuk</w:t>
+      </w:r>
+    </w:p>
+    <w:p>
+      <w:r>
+        <w:t xml:space="preserve">  (kalau ikut dihapus, murid yang baru mengganti sandinya justru terlempar keluar). Jalur ini dibatasi 6</w:t>
+      </w:r>
+    </w:p>
+    <w:p>
+      <w:r>
+        <w:t xml:space="preserve">  percobaan per menit per akun, supaya sesi yang tertinggal di komputer lab tidak bisa dipakai menebak sandi.</w:t>
+      </w:r>
+    </w:p>
+    <w:p>
+      <w:pPr>
+        <w:pStyle w:val="ListBullet"/>
+      </w:pPr>
+      <w:r>
+        <w:t>**Akun siswa tamu** tidak punya sandi (masuknya lewat kode perangkat), jadi halaman ini memberi tahu apa</w:t>
+      </w:r>
+    </w:p>
+    <w:p>
+      <w:r>
+        <w:t xml:space="preserve">  adanya dan menawarkan daftar sebagai murid — bukan menampilkan formulir yang pasti ditolak.</w:t>
+      </w:r>
+    </w:p>
+    <w:p>
+      <w:r/>
+    </w:p>
+    <w:p>
+      <w:pPr>
+        <w:pStyle w:val="Heading3"/>
+      </w:pPr>
+      <w:r>
+        <w:t>Manfaat untuk anak SD dan guru</w:t>
+      </w:r>
+    </w:p>
+    <w:p>
+      <w:r>
+        <w:t>Guru dan murid sama-sama bisa memperbaiki namanya sendiri (salah ketik saat didaftarkan, atau nama panggilan)</w:t>
+      </w:r>
+    </w:p>
+    <w:p>
+      <w:r>
+        <w:t>tanpa menunggu admin, dan siapa pun yang merasa sandinya diketahui orang lain bisa menggantinya dari komputer</w:t>
+      </w:r>
+    </w:p>
+    <w:p>
+      <w:r>
+        <w:t>sekolah tanpa perlu akses email.</w:t>
+      </w:r>
+    </w:p>
+    <w:p>
+      <w:r/>
+    </w:p>
+    <w:p>
+      <w:r>
+        <w:t>Status: **sudah bisa dipakai** (13 Oktober 2026). Setelan ulangan (proteksi, percobaan ulang, peringkat)</w:t>
+      </w:r>
+    </w:p>
+    <w:p>
+      <w:r>
+        <w:t>tidak ada di halaman ini lagi — ia menyatu dengan tiap kuis (bagian 5). Yang belum ada: halaman ini belum</w:t>
+      </w:r>
+    </w:p>
+    <w:p>
+      <w:r>
+        <w:t>menampilkan daftar perangkat/sesi yang sedang masuk.</w:t>
+      </w:r>
+    </w:p>
+    <w:p>
+      <w:r/>
+    </w:p>
+    <w:p>
+      <w:r>
+        <w:t>────────────────────────────────────────</w:t>
+      </w:r>
+    </w:p>
+    <w:p>
+      <w:r/>
+    </w:p>
+    <w:p>
+      <w:pPr>
+        <w:pStyle w:val="Heading2"/>
+      </w:pPr>
+      <w:r>
+        <w:t>22. Bundel yang dipotong per halaman</w:t>
+      </w:r>
+    </w:p>
+    <w:p>
+      <w:r/>
+    </w:p>
+    <w:p>
+      <w:pPr>
+        <w:pStyle w:val="Heading3"/>
+      </w:pPr>
+      <w:r>
+        <w:t>Apa ini</w:t>
+      </w:r>
+    </w:p>
+    <w:p>
+      <w:r>
+        <w:t>Kode aplikasi tidak lagi dikirim sebagai satu berkas JavaScript raksasa. Setiap halaman jadi **potongannya</w:t>
+      </w:r>
+    </w:p>
+    <w:p>
+      <w:r>
+        <w:t>sendiri** yang baru diunduh saat halamannya dibuka (`React.lazy` + `Suspense`); yang ikut terkirim sejak awal</w:t>
+      </w:r>
+    </w:p>
+    <w:p>
+      <w:r>
+        <w:t>hanya kerangka aplikasi, **Beranda**, **halaman masuk**, dan **halaman 404**.</w:t>
+      </w:r>
+    </w:p>
+    <w:p>
+      <w:r/>
+    </w:p>
+    <w:p>
+      <w:pPr>
+        <w:pStyle w:val="Heading3"/>
+      </w:pPr>
+      <w:r>
+        <w:t>Cara kerjanya</w:t>
+      </w:r>
+    </w:p>
+    <w:p>
+      <w:r>
+        <w:t>Daftar pemuat halaman ada di satu berkas, `frontend/src/halaman.js`. Di sana tiap halaman dibungkus</w:t>
+      </w:r>
+    </w:p>
+    <w:p>
+      <w:r>
+        <w:t>`React.lazy`, dan peta `pramuat` menghubungkan jalur menu (`/kelas`, `/bank-soal`, `/kuis`, …) dengan modulnya.</w:t>
+      </w:r>
+    </w:p>
+    <w:p>
+      <w:r>
+        <w:t>Tautan menu di panel samping **mulai mengunduh modul halamannya begitu disorot atau difokus**</w:t>
+      </w:r>
+    </w:p>
+    <w:p>
+      <w:r>
+        <w:t>(`onMouseEnter`/`onFocus`) — jadi bundel awalnya kecil, tetapi perpindahan menu tetap terasa seketika,</w:t>
+      </w:r>
+    </w:p>
+    <w:p>
+      <w:r>
+        <w:t>terutama di ponsel yang menyentuh dulu sebelum menekan.</w:t>
+      </w:r>
+    </w:p>
+    <w:p>
+      <w:r/>
+    </w:p>
+    <w:p>
+      <w:r>
+        <w:t>Yang menunggu ditangani `Suspense` yang dipasang **di dalam** kerangka (di area konten), bukan membungkus</w:t>
+      </w:r>
+    </w:p>
+    <w:p>
+      <w:r>
+        <w:t>seluruh aplikasi. Akibatnya menu, bilah atas, dan kaki halaman tetap tampil selama modul diunduh — tidak pernah</w:t>
+      </w:r>
+    </w:p>
+    <w:p>
+      <w:r>
+        <w:t>ada layar kosong. Penandanya (`MemuatHalaman`) muncul dengan **jeda 150 ms** lalu memudar masuk lewat CSS:</w:t>
+      </w:r>
+    </w:p>
+    <w:p>
+      <w:r>
+        <w:t>pada modul yang sudah tersimpan di cache peramban (kasus paling umum saat berpindah halaman) penandanya sama</w:t>
+      </w:r>
+    </w:p>
+    <w:p>
+      <w:r>
+        <w:t>sekali tidak terlihat, jadi tidak ada kedipan. Tingginya juga diisi supaya kaki halaman tidak melompat naik-turun.</w:t>
+      </w:r>
+    </w:p>
+    <w:p>
+      <w:r/>
+    </w:p>
+    <w:p>
+      <w:r>
+        <w:t>Angka hasil `npm run build` di mesin pengembangan:</w:t>
+      </w:r>
+    </w:p>
+    <w:p>
+      <w:r/>
+    </w:p>
+    <w:p>
+      <w:r>
+        <w:t>| | Sebelum | Sesudah |</w:t>
+      </w:r>
+    </w:p>
+    <w:p>
+      <w:r>
+        <w:t>| --- | --- | --- |</w:t>
+      </w:r>
+    </w:p>
+    <w:p>
+      <w:r>
+        <w:t>| JavaScript yang diunduh sebelum halaman tampil | **923,63 kB** (262,06 kB gzip), satu berkas | **555,26 kB** (176,35 kB gzip) — berkas utama + 5 berkas yang di-`modulepreload` `index.html` |</w:t>
+      </w:r>
+    </w:p>
+    <w:p>
+      <w:r>
+        <w:t>| Jumlah berkas JS | 1 | 54 (halaman lain menyusul saat dibuka) |</w:t>
+      </w:r>
+    </w:p>
+    <w:p>
+      <w:r/>
+    </w:p>
+    <w:p>
+      <w:r>
+        <w:t>Contoh yang tidak lagi ikut ke setiap pengguna: layar pengerjaan ulangan **41,57 kB** (14,27 kB gzip),</w:t>
+      </w:r>
+    </w:p>
+    <w:p>
+      <w:r>
+        <w:t>editor soal **46,52 kB**, editor materi **30,84 kB**, dan renderer soal **31,94 kB**. Murid yang mengerjakan</w:t>
+      </w:r>
+    </w:p>
+    <w:p>
+      <w:r>
+        <w:t>ulangan di ponsel kelas tidak lagi mengunduh alat guru, dan guru tidak mengunduh layar ulangan anak.</w:t>
+      </w:r>
+    </w:p>
+    <w:p>
+      <w:r/>
+    </w:p>
+    <w:p>
+      <w:r>
+        <w:t>Angka itu juga diperiksa **di peramban sungguhan** (bangun produksi, `docs/ukur-bundel-peramban.mjs`):</w:t>
+      </w:r>
+    </w:p>
+    <w:p>
+      <w:r>
+        <w:t>membuka aplikasi hanya meminta **6 berkas JS (555,30 kB)** — sama persis dengan keenam berkas di `index.html` —</w:t>
+      </w:r>
+    </w:p>
+    <w:p>
+      <w:r>
+        <w:t>sedangkan menekan tautan “Daftar” hanya menambah **2 berkas kecil (3,5 kB)** tanpa memuat ulang halaman.</w:t>
+      </w:r>
+    </w:p>
+    <w:p>
+      <w:r/>
+    </w:p>
+    <w:p>
+      <w:pPr>
+        <w:pStyle w:val="Heading3"/>
+      </w:pPr>
+      <w:r>
+        <w:t>Manfaat untuk anak SD dan guru</w:t>
+      </w:r>
+    </w:p>
+    <w:p>
+      <w:r>
+        <w:t>Halaman pertama muncul lebih cepat di jaringan sekolah yang lambat — sekitar **sepertiga** lebih sedikit data</w:t>
+      </w:r>
+    </w:p>
+    <w:p>
+      <w:r>
+        <w:t>yang harus lewat sebelum apa pun terlihat (`262 kB` → `176 kB` gzip). Ini juga menghemat kuota ponsel murid.</w:t>
+      </w:r>
+    </w:p>
+    <w:p>
+      <w:r/>
+    </w:p>
+    <w:p>
+      <w:r>
+        <w:t>Status: **sudah bisa dipakai** (13 Oktober 2026). Yang sengaja tetap di bundel awal: kerangka aplikasi,</w:t>
+      </w:r>
+    </w:p>
+    <w:p>
+      <w:r>
+        <w:t>Beranda (halaman pertama semua orang, termasuk tamu), halaman masuk, 404, dan pagar galat ulangan — menunda</w:t>
+      </w:r>
+    </w:p>
+    <w:p>
+      <w:r>
+        <w:t>keempatnya hanya menambah satu putaran jaringan di detik-detik pertama tanpa menghemat apa pun yang berarti.</w:t>
+      </w:r>
+    </w:p>
+    <w:p>
+      <w:r>
+        <w:t>Halaman auth selain “Masuk” juga malas, tetapi tidak dipramuat karena tidak punya tautan menu yang bisa disorot.</w:t>
+      </w:r>
+    </w:p>
+    <w:p>
+      <w:r>
+        <w:t>Dua potongan vendor tetap besar dan tetap ikut di awal karena memang selalu dipakai (`react-dom` + react +</w:t>
+      </w:r>
+    </w:p>
+    <w:p>
+      <w:r>
+        <w:t>zustand 328,98 kB; `axios` + `react-router` 209,85 kB) — itu batas tumpukan yang dipilih, bukan sisa kode halaman.</w:t>
       </w:r>
     </w:p>
     <w:p>

</xml_diff>

<commit_message>
Catat putaran A.90 & segarkan dokumen untuk dikumpulkan
Pekerjaan materi (commit 547d140) sudah jalan tetapi belum punya bagian
laporan, sehingga handoff masih menunjuk keadaan A.88/A.89 dan dokumen yang
dikumpulkan belum memuatnya. Laporan kini punya bagian A.90 beserta batas
jujurnya (pratinjau diuji dengan ZIP buatan tes, belum pernah dibuka di Chrome),
handoff menyebut HEAD/origin/main yang benar, dan `docs/export-word.sh` dijalankan
ulang sehingga `docs/word/*.docx` + log mentah sesi ini ikut terbarui. Pagar mutu
dijalankan ulang atas pohon ini: Vitest 1064 lulus, `tsc --noEmit` bersih, ESLint
0 galat, Pint PASS.

Berkas yang hanya berubah karena cap waktu ekspor (dua gzip sesi lama, `info.json`,
`transkrip.md`, dan dua docx yang isinya identik) sengaja tidak ikut dikomit.

🤖 Generated with Codebuff
Co-Authored-By: Codebuff <noreply@codebuff.com>
</commit_message>
<xml_diff>
--- a/docs/word/penjelasan-fitur.docx
+++ b/docs/word/penjelasan-fitur.docx
@@ -4438,6 +4438,419 @@
     <w:p>
       <w:r>
         <w:t>zustand 328,98 kB; `axios` + `react-router` 209,85 kB) — itu batas tumpukan yang dipilih, bukan sisa kode halaman.</w:t>
+      </w:r>
+    </w:p>
+    <w:p>
+      <w:r/>
+    </w:p>
+    <w:p>
+      <w:r>
+        <w:t>────────────────────────────────────────</w:t>
+      </w:r>
+    </w:p>
+    <w:p>
+      <w:r/>
+    </w:p>
+    <w:p>
+      <w:pPr>
+        <w:pStyle w:val="Heading2"/>
+      </w:pPr>
+      <w:r>
+        <w:t>23. Masuk &amp; daftar lewat Google — dengan kata sandi sekali di awal (14 Oktober 2026)</w:t>
+      </w:r>
+    </w:p>
+    <w:p>
+      <w:r/>
+    </w:p>
+    <w:p>
+      <w:r>
+        <w:t>Murid yang emailnya sudah punya akun Google tidak perlu mengetik apa pun: satu tekan tombol di halaman</w:t>
+      </w:r>
+    </w:p>
+    <w:p>
+      <w:r>
+        <w:t>**Masuk** atau **Daftar**, dan ia masuk. Yang emailnya belum terdaftar **langsung dibuatkan akun** — jadi</w:t>
+      </w:r>
+    </w:p>
+    <w:p>
+      <w:r>
+        <w:t>satu tombol itu melayani dua hal sekaligus (masuk *dan* daftar).</w:t>
+      </w:r>
+    </w:p>
+    <w:p>
+      <w:r/>
+    </w:p>
+    <w:p>
+      <w:pPr>
+        <w:pStyle w:val="Heading3"/>
+      </w:pPr>
+      <w:r>
+        <w:t>Cara kerjanya (dan mengapa tidak ada rahasia yang ikut ke peramban)</w:t>
+      </w:r>
+    </w:p>
+    <w:p>
+      <w:r>
+        <w:t>Klien memakai **Google Identity Services**, menerima **ID token** (JWT bertanda tangan Google), lalu</w:t>
+      </w:r>
+    </w:p>
+    <w:p>
+      <w:r>
+        <w:t>mengirimkannya ke `POST /v1/auth/google`. Server **memeriksa sendiri** token itu</w:t>
+      </w:r>
+    </w:p>
+    <w:p>
+      <w:r>
+        <w:t>(`GoogleIdTokenVerifier`): tanda tangan RS256 dicocokkan dengan kunci publik Google (JWKS, di-cache,</w:t>
+      </w:r>
+    </w:p>
+    <w:p>
+      <w:r>
+        <w:t>disegarkan sendiri bila kuncinya dirotasi), lalu `iss`/`exp`/`aud` diperiksa — **`aud` wajib milik aplikasi</w:t>
+      </w:r>
+    </w:p>
+    <w:p>
+      <w:r>
+        <w:t>ini**, sebab tanpa itu ID token aplikasi Google lain bisa dipakai masuk — dan `email_verified` harus benar.</w:t>
+      </w:r>
+    </w:p>
+    <w:p>
+      <w:r>
+        <w:t>`client_secret` tidak dibutuhkan alur ini dan tidak pernah dikirim ke peramban; yang tahu id klien hanyalah</w:t>
+      </w:r>
+    </w:p>
+    <w:p>
+      <w:r>
+        <w:t>`GET /v1/auth/google` (publik, bukan rahasia). Bila sekolah belum mengisi `GOOGLE_CLIENT_ID`, server</w:t>
+      </w:r>
+    </w:p>
+    <w:p>
+      <w:r>
+        <w:t>menjawab `aktif: false` dan **tombolnya tidak pernah muncul** — anak tidak melihat pintu yang pasti gagal.</w:t>
+      </w:r>
+    </w:p>
+    <w:p>
+      <w:r/>
+    </w:p>
+    <w:p>
+      <w:pPr>
+        <w:pStyle w:val="Heading3"/>
+      </w:pPr>
+      <w:r>
+        <w:t>Akun Google tetap akun biasa — dan wajib punya kata sandi sendiri</w:t>
+      </w:r>
+    </w:p>
+    <w:p>
+      <w:r>
+        <w:t>Tiga hal yang membuatnya benar-benar setara akun lain:</w:t>
+      </w:r>
+    </w:p>
+    <w:p>
+      <w:r/>
+    </w:p>
+    <w:p>
+      <w:r>
+        <w:t>1. **Satu akun per email.** Email dari Google sudah pasti milik pemakainya, jadi bila emailnya sudah</w:t>
+      </w:r>
+    </w:p>
+    <w:p>
+      <w:r>
+        <w:t xml:space="preserve">   terdaftar (dibuat sekolah lewat impor, atau lebih dulu lewat Google), akun **itu** yang dipakai — tidak</w:t>
+      </w:r>
+    </w:p>
+    <w:p>
+      <w:r>
+        <w:t xml:space="preserve">   ada akun kedua untuk anak yang sama. Kata sandi lamanya **tidak disentuh**: murid yang biasa masuk dengan</w:t>
+      </w:r>
+    </w:p>
+    <w:p>
+      <w:r>
+        <w:t xml:space="preserve">   kata sandi tetap bisa begitu. Email yang sudah dibuktikan Google dianggap terverifikasi, jadi akun yang</w:t>
+      </w:r>
+    </w:p>
+    <w:p>
+      <w:r>
+        <w:t xml:space="preserve">   tadinya `pending` (belum membuka tautan verifikasi) langsung aktif.</w:t>
+      </w:r>
+    </w:p>
+    <w:p>
+      <w:r>
+        <w:t>2. **Akun baru = peran murid, seperti pendaftaran mandiri** — guru/admin tidak bisa lahir dari tombol di</w:t>
+      </w:r>
+    </w:p>
+    <w:p>
+      <w:r>
+        <w:t xml:space="preserve">   halaman masuk, dan muridnya langsung masuk kelas penampung sampai guru menempatkannya.</w:t>
+      </w:r>
+    </w:p>
+    <w:p>
+      <w:r>
+        <w:t>3. **Satu lapisan sekali seumur akun: buat kata sandi.** Akun yang lahir dari Google dibuat server dengan</w:t>
+      </w:r>
+    </w:p>
+    <w:p>
+      <w:r>
+        <w:t xml:space="preserve">   kata sandi acak 40 karakter yang **tidak pernah diberitahukan ke siapa pun**, jadi murid diminta membuat</w:t>
+      </w:r>
+    </w:p>
+    <w:p>
+      <w:r>
+        <w:t xml:space="preserve">   kata sandinya sendiri di `/buat-sandi` sebelum memakai aplikasi. Sebelum itu middleware `sandi-disetel`</w:t>
+      </w:r>
+    </w:p>
+    <w:p>
+      <w:r>
+        <w:t xml:space="preserve">   menolak 403 semua rute lain (hanya akun sendiri, keluar, dan pembuatan sandi yang boleh) — halaman lain</w:t>
+      </w:r>
+    </w:p>
+    <w:p>
+      <w:r>
+        <w:t xml:space="preserve">   juga mengalihkannya, jadi tidak ada jalan memutar dengan mengetik alamat halaman. Rute pembuatan sandi</w:t>
+      </w:r>
+    </w:p>
+    <w:p>
+      <w:r>
+        <w:t xml:space="preserve">   otomatis tertutup setelah dipakai: penggantian berikutnya wajib lewat jalur ganti sandi yang meminta</w:t>
+      </w:r>
+    </w:p>
+    <w:p>
+      <w:r>
+        <w:t xml:space="preserve">   sandi lama.</w:t>
+      </w:r>
+    </w:p>
+    <w:p>
+      <w:r/>
+    </w:p>
+    <w:p>
+      <w:r>
+        <w:t>Sesudah kata sandinya ada, murid masuk seperti biasa — **tidak pernah ditanya kata sandi lagi selama</w:t>
+      </w:r>
+    </w:p>
+    <w:p>
+      <w:r>
+        <w:t>sesinya masih hidup**, dan boleh memakai tombol Google kapan saja (dua-duanya menuju akun yang sama).</w:t>
+      </w:r>
+    </w:p>
+    <w:p>
+      <w:r>
+        <w:t>Mengapa justru diminta sekali: kata sandi itu satu-satunya jalan masuk bila akun Google-nya tidak bisa</w:t>
+      </w:r>
+    </w:p>
+    <w:p>
+      <w:r>
+        <w:t>dipakai (ganti perangkat, akun anak ditutup sekolah) — akun tanpa sandi bisa terkunci permanen.</w:t>
+      </w:r>
+    </w:p>
+    <w:p>
+      <w:r/>
+    </w:p>
+    <w:p>
+      <w:pPr>
+        <w:pStyle w:val="Heading3"/>
+      </w:pPr>
+      <w:r>
+        <w:t>Kalau akunnya dibatasi sekolah</w:t>
+      </w:r>
+    </w:p>
+    <w:p>
+      <w:r>
+        <w:t>Akun yang ditangguhkan/dihapus tetap ditolak **walau lewat Google** — status akun adalah keputusan sekolah,</w:t>
+      </w:r>
+    </w:p>
+    <w:p>
+      <w:r>
+        <w:t>bukan sesuatu yang bisa dilewati dengan memilih pintu masuk lain. Akun Google yang belum bersandi juga tidak</w:t>
+      </w:r>
+    </w:p>
+    <w:p>
+      <w:r>
+        <w:t>bisa dimasuki lewat kolom kata sandi (sandi acaknya tidak diketahui siapa pun, dan jalur sandi memang</w:t>
+      </w:r>
+    </w:p>
+    <w:p>
+      <w:r>
+        <w:t>ditutup sampai sandinya dibuat).</w:t>
+      </w:r>
+    </w:p>
+    <w:p>
+      <w:r/>
+    </w:p>
+    <w:p>
+      <w:r>
+        <w:t>────────────────────────────────────────</w:t>
+      </w:r>
+    </w:p>
+    <w:p>
+      <w:r/>
+    </w:p>
+    <w:p>
+      <w:pPr>
+        <w:pStyle w:val="Heading2"/>
+      </w:pPr>
+      <w:r>
+        <w:t>24. Materi yang benar-benar ditampilkan (14 Oktober 2026)</w:t>
+      </w:r>
+    </w:p>
+    <w:p>
+      <w:r/>
+    </w:p>
+    <w:p>
+      <w:pPr>
+        <w:pStyle w:val="Heading3"/>
+      </w:pPr>
+      <w:r>
+        <w:t>Apa ini</w:t>
+      </w:r>
+    </w:p>
+    <w:p>
+      <w:r>
+        <w:t>Bahan ajar guru di halaman **Materi** tidak lagi berhenti di tombol unduh. Dua bentuk materi yang tadinya</w:t>
+      </w:r>
+    </w:p>
+    <w:p>
+      <w:r>
+        <w:t>cuma "bisa dibuka" kini tampil di halaman murid:</w:t>
+      </w:r>
+    </w:p>
+    <w:p>
+      <w:r/>
+    </w:p>
+    <w:p>
+      <w:pPr>
+        <w:pStyle w:val="ListBullet"/>
+      </w:pPr>
+      <w:r>
+        <w:t>**Dokumen kantor** (`.docx`, `.pptx`, `.xlsx`) — isinya dibaca di peramban lalu ditampilkan sebagai teks,</w:t>
+      </w:r>
+    </w:p>
+    <w:p>
+      <w:r>
+        <w:t xml:space="preserve">  butir/deret slide, tabel, dan gambar.</w:t>
+      </w:r>
+    </w:p>
+    <w:p>
+      <w:pPr>
+        <w:pStyle w:val="ListBullet"/>
+      </w:pPr>
+      <w:r>
+        <w:t>**Klip tautan** (YouTube/Drive) — videonya benar-benar dipasang sebagai bingkai di halaman, lengkap dengan</w:t>
+      </w:r>
+    </w:p>
+    <w:p>
+      <w:r>
+        <w:t xml:space="preserve">  kuis sisipan yang bisa ditumpukkan di atasnya.</w:t>
+      </w:r>
+    </w:p>
+    <w:p>
+      <w:r/>
+    </w:p>
+    <w:p>
+      <w:pPr>
+        <w:pStyle w:val="Heading3"/>
+      </w:pPr>
+      <w:r>
+        <w:t>Cara kerjanya</w:t>
+      </w:r>
+    </w:p>
+    <w:p>
+      <w:r>
+        <w:t>Berkas OOXML sebetulnya arsip ZIP berisi XML, dan `jszip` sudah dipakai proyek ini, jadi</w:t>
+      </w:r>
+    </w:p>
+    <w:p>
+      <w:r>
+        <w:t>`pratinjauOOXML.js` membuka `word/document.xml`, `ppt/slides/*.xml`, atau `xl/worksheets/*.xml`, membaca</w:t>
+      </w:r>
+    </w:p>
+    <w:p>
+      <w:r>
+        <w:t>paragraf, butir, tabel, gambar, dan string bersama Excel, lalu digambar `PratinjauDokumen.jsx` di dalam</w:t>
+      </w:r>
+    </w:p>
+    <w:p>
+      <w:r>
+        <w:t>kotak setinggi `min(70vh, 40rem)` (kepalanya lengket) supaya tombol "Tandai selesai" tidak terdorong jauh ke</w:t>
+      </w:r>
+    </w:p>
+    <w:p>
+      <w:r>
+        <w:t>bawah. Byte gambar dijadikan URL objek sekali per berkas dan dilepas saat pratinjaunya berganti.</w:t>
+      </w:r>
+    </w:p>
+    <w:p>
+      <w:r/>
+    </w:p>
+    <w:p>
+      <w:r>
+        <w:t>Untuk klip tautan, alamat bingkai tetap **dihitung server** (`Registry\TautanMedia` → `media.sematan`,</w:t>
+      </w:r>
+    </w:p>
+    <w:p>
+      <w:r>
+        <w:t>youtube-nocookie atau Drive preview); klien tidak pernah menyusun alamat bingkai sendiri, jadi guru tidak</w:t>
+      </w:r>
+    </w:p>
+    <w:p>
+      <w:r>
+        <w:t>bisa menyelipkan bingkai dari host sembarang. Karena klip tautan tidak memberi `currentTime`, kuis sisipan di</w:t>
+      </w:r>
+    </w:p>
+    <w:p>
+      <w:r>
+        <w:t>dalamnya dibuka lewat daftar tombol seperti sebelumnya.</w:t>
+      </w:r>
+    </w:p>
+    <w:p>
+      <w:r/>
+    </w:p>
+    <w:p>
+      <w:r>
+        <w:t>Batas yang jelas: pratinjau ini teks, tabel, dan gambar — bukan tata letak, animasi, bagan, atau rumus.</w:t>
+      </w:r>
+    </w:p>
+    <w:p>
+      <w:r>
+        <w:t>Tautan ke berkas aslinya selalu disediakan di bawah pratinjau, dan format kantor lama (`.doc`/`.ppt`/`.xls`)</w:t>
+      </w:r>
+    </w:p>
+    <w:p>
+      <w:r>
+        <w:t>tetap memakai tombol "Buka dokumen" seperti dulu supaya tidak ada materi yang hilang dari layar.</w:t>
+      </w:r>
+    </w:p>
+    <w:p>
+      <w:r/>
+    </w:p>
+    <w:p>
+      <w:r>
+        <w:t>Satu keluhan lain ikut ditutup: kuis yang disisipkan ke blok **teks/gambar** dulu tidak bisa dibuka murid,</w:t>
+      </w:r>
+    </w:p>
+    <w:p>
+      <w:r>
+        <w:t>padahal bagian itu tidak bisa ditutup selama kuis wajibnya belum selesai. Sekarang latihan itu ditawarkan di</w:t>
+      </w:r>
+    </w:p>
+    <w:p>
+      <w:r>
+        <w:t>bawah bacaannya (tidak menumpuk di atas media — tidak ada yang sedang diputar), sedangkan pada video dan klip</w:t>
+      </w:r>
+    </w:p>
+    <w:p>
+      <w:r>
+        <w:t>tautan panelnya tetap menumpuk di atas medianya seperti kuis di dalam video.</w:t>
+      </w:r>
+    </w:p>
+    <w:p>
+      <w:r/>
+    </w:p>
+    <w:p>
+      <w:r>
+        <w:t>Status: **sudah bisa dipakai** (14 unit test pembaca OOXML + 5 test komponen pratinjau + 3 test halaman materi</w:t>
+      </w:r>
+    </w:p>
+    <w:p>
+      <w:r>
+        <w:t>murid; `npm run check`, ESLint, dan 1.063 test frontend hijau).</w:t>
       </w:r>
     </w:p>
     <w:p>

</xml_diff>

<commit_message>
Segarkan dua dokumen Word yang berubah (A.91–A.92)
Laporan pengujian dan penjelasan fitur memuat putaran pintu tamu yang baru selesai,
jadi keduanya diekspor ulang (log mentah tidak disentuh: isinya hanya bertambah
bila sesi ini benar-benar diekspor ulang lewat docs/export-word.sh).

🤖 Generated with Codebuff
Co-Authored-By: Codebuff <noreply@codebuff.com>
</commit_message>
<xml_diff>
--- a/docs/word/penjelasan-fitur.docx
+++ b/docs/word/penjelasan-fitur.docx
@@ -4979,6 +4979,196 @@
     <w:p>
       <w:r>
         <w:t>**Yang tidak boleh dipotong apa pun alasannya:** deploy dengan link yang bisa dibuka, Octane Swoole (atau catatan jujur bila gagal), keamanan inti (auth, pembatasan akses antar murid, kunci jawaban tidak bocor, deadline dari server), serta jurnal prompt dan log mentah yang jujur.</w:t>
+      </w:r>
+    </w:p>
+    <w:p>
+      <w:r/>
+    </w:p>
+    <w:p>
+      <w:r>
+        <w:t>────────────────────────────────────────</w:t>
+      </w:r>
+    </w:p>
+    <w:p>
+      <w:r/>
+    </w:p>
+    <w:p>
+      <w:pPr>
+        <w:pStyle w:val="Heading2"/>
+      </w:pPr>
+      <w:r>
+        <w:t>25. Pintu siswa tamu: siapa yang boleh membukanya (15 Oktober 2026)</w:t>
+      </w:r>
+    </w:p>
+    <w:p>
+      <w:r/>
+    </w:p>
+    <w:p>
+      <w:pPr>
+        <w:pStyle w:val="Heading3"/>
+      </w:pPr>
+      <w:r>
+        <w:t>Apa ini</w:t>
+      </w:r>
+    </w:p>
+    <w:p>
+      <w:r>
+        <w:t>Siswa tamu = anak yang ikut ulangan **tanpa akun sekolah**. Pintunya ada di **panel Setelan ulangan** pada</w:t>
+      </w:r>
+    </w:p>
+    <w:p>
+      <w:r>
+        <w:t>halaman kuis: “Izinkan siswa tamu ikut kuis ini tanpa akun (cukup nama)”. Saklar itu disimpan **per kuis**.</w:t>
+      </w:r>
+    </w:p>
+    <w:p>
+      <w:r/>
+    </w:p>
+    <w:p>
+      <w:pPr>
+        <w:pStyle w:val="Heading3"/>
+      </w:pPr>
+      <w:r>
+        <w:t>Siapa yang boleh menyalakannya</w:t>
+      </w:r>
+    </w:p>
+    <w:p>
+      <w:pPr>
+        <w:pStyle w:val="ListBullet"/>
+      </w:pPr>
+      <w:r>
+        <w:t>**Guru pemilik kuis.** Ia yang mengatur ulangan itu, jadi pintunya miliknya.</w:t>
+      </w:r>
+    </w:p>
+    <w:p>
+      <w:pPr>
+        <w:pStyle w:val="ListBullet"/>
+      </w:pPr>
+      <w:r>
+        <w:t>**Kepala sekolah (peran `admin`) hanya melihat.** Ia boleh membuka panelnya untuk meninjau, tetapi setiap</w:t>
+      </w:r>
+    </w:p>
+    <w:p>
+      <w:r>
+        <w:t xml:space="preserve">  perubahan ditolak server dengan pesan yang jelas: *“Setelan ulangan ini hanya bisa diubah guru pemilik</w:t>
+      </w:r>
+    </w:p>
+    <w:p>
+      <w:r>
+        <w:t xml:space="preserve">  kuisnya. Kepala sekolah hanya melihat.”* Sejak 15 Oktober 2026 panelnya karena itu langsung tampil</w:t>
+      </w:r>
+    </w:p>
+    <w:p>
+      <w:r>
+        <w:t xml:space="preserve">  **hanya-baca** (saklarnya mati + sebabnya ditulis) — sebelumnya saklarnya tampak bisa ditekan dan guru wajar</w:t>
+      </w:r>
+    </w:p>
+    <w:p>
+      <w:r>
+        <w:t xml:space="preserve">  bertanya “apakah setelannya masuk?”.</w:t>
+      </w:r>
+    </w:p>
+    <w:p>
+      <w:pPr>
+        <w:pStyle w:val="ListBullet"/>
+      </w:pPr>
+      <w:r>
+        <w:t>**Lapis sekolah dan kelas** tidak diubah dari aplikasi: aturan proteksi berlaku sama untuk seluruh sekolah,</w:t>
+      </w:r>
+    </w:p>
+    <w:p>
+      <w:r>
+        <w:t xml:space="preserve">  jadi tidak ada satu guru pun yang boleh memutuskannya sendiri.</w:t>
+      </w:r>
+    </w:p>
+    <w:p>
+      <w:r/>
+    </w:p>
+    <w:p>
+      <w:pPr>
+        <w:pStyle w:val="Heading3"/>
+      </w:pPr>
+      <w:r>
+        <w:t>Pintunya baru terbuka bila kuisnya sudah terbit</w:t>
+      </w:r>
+    </w:p>
+    <w:p>
+      <w:r>
+        <w:t>Ini bagian yang paling mudah disalahpahami: menyalakan saklarnya **belum cukup**. Halaman masuk menawarkan</w:t>
+      </w:r>
+    </w:p>
+    <w:p>
+      <w:r>
+        <w:t>formulir tamu hanya bila ada **kuis terbit** yang membukanya (`TamuService::tersedia`). Kuis **draf** tidak</w:t>
+      </w:r>
+    </w:p>
+    <w:p>
+      <w:r>
+        <w:t>pernah membuka pintu — tamu tidak boleh melihat kuis yang belum diterbitkan guru.</w:t>
+      </w:r>
+    </w:p>
+    <w:p>
+      <w:r/>
+    </w:p>
+    <w:p>
+      <w:r>
+        <w:t>Bila anak membuka tautan ulangan sementara pintunya masih tertutup, halaman masuk sekarang mengatakan</w:t>
+      </w:r>
+    </w:p>
+    <w:p>
+      <w:r>
+        <w:t>sebabnya apa adanya: *“Ulangan ini belum dibuka untuk siswa tanpa akun — minta gurumu menyalakan ‘Izinkan</w:t>
+      </w:r>
+    </w:p>
+    <w:p>
+      <w:r>
+        <w:t>siswa tamu’ untuk kuis ini, lalu menerbitkan kuisnya.”* Jadi anak (dan guru yang menguji tautannya sendiri)</w:t>
+      </w:r>
+    </w:p>
+    <w:p>
+      <w:r>
+        <w:t>tidak lagi hanya melihat kolom email + kata sandi lalu merasa dipaksa masuk.</w:t>
+      </w:r>
+    </w:p>
+    <w:p>
+      <w:r/>
+    </w:p>
+    <w:p>
+      <w:pPr>
+        <w:pStyle w:val="Heading3"/>
+      </w:pPr>
+      <w:r>
+        <w:t>Urutan yang benar untuk mengundang anak tanpa akun</w:t>
+      </w:r>
+    </w:p>
+    <w:p>
+      <w:r>
+        <w:t>1. Masuk sebagai **guru pemilik kuis**.</w:t>
+      </w:r>
+    </w:p>
+    <w:p>
+      <w:r>
+        <w:t>2. Susun kuisnya, lalu **terbitkan**.</w:t>
+      </w:r>
+    </w:p>
+    <w:p>
+      <w:r>
+        <w:t>3. Nyalakan **“Izinkan siswa tamu”** di panel Setelan ulangan kuis itu.</w:t>
+      </w:r>
+    </w:p>
+    <w:p>
+      <w:r>
+        <w:t>4. Bagikan tautan siswa (halaman kelola kuis menyediakan tombol salin).</w:t>
+      </w:r>
+    </w:p>
+    <w:p>
+      <w:r>
+        <w:t>5. Anak membuka tautan → menulis namanya → langsung mengerjakan. Hasilnya tercatat atas namanya dan bisa</w:t>
+      </w:r>
+    </w:p>
+    <w:p>
+      <w:r>
+        <w:t xml:space="preserve">   dilihat guru pemilik kuis di halaman kuis itu.</w:t>
       </w:r>
     </w:p>
     <w:sectPr>

</xml_diff>

<commit_message>
Buka jawaban tiap murid dari Monitor Ulangan dan satukan log AI luar repo
Guru yang melihat satu anak berhenti di soal 7 kini bisa membaca apa yang sudah
ditulis anak itu langsung dari Monitor Ulangan, tanpa berjalan ke mejanya dan
tanpa menunggu ulangannya dikumpulkan. Lembar itu sengaja tanpa kunci jawaban
dan tanpa nilai per soal: layar monitor terbuka di depan kelas, sedangkan nilai
per soal tetap di halaman koreksi manual yang mencatat alasan tiap perubahan.

Sekaligus: pekerjaan AI luar repo (Claude) tidak lagi tersimpan di folder
terpisah `docs/log-mentah/eksternal/`. Isinya menjadi salah satu sesi di daftar
log mentah yang sama (`2026-10-10T06-22-04.000Z-eksternal-claude/`) dan ditandai
"Sumber: Claude (di luar repo)" di indeks, jadi ikut terbaca bersama log lain
tanpa kehilangan asal-usulnya — sekaligus indeksnya tidak lagi bisa menghapus
sesi luar repo saat ekspor dijalankan ulang.

🤖 Generated with Codebuff
Co-Authored-By: Codebuff <noreply@codebuff.com>
</commit_message>
<xml_diff>
--- a/docs/word/penjelasan-fitur.docx
+++ b/docs/word/penjelasan-fitur.docx
@@ -1539,13 +1539,21 @@
     </w:p>
     <w:p>
       <w:r>
-        <w:t>bersifat tak bisa dihapus dan tak bisa diubah isinya). Panel di halaman koreksi hanya membaca. Saat menyala: menempel jawaban dari luar diblok dan dicatat, pindah tab dicatat satu kali per kepergian, buka layar penuh yang keluar diberi peringatan. Semua kejadian hanya **catatan untuk guru** — bukan hukuman otomatis. Presence bekerja hemat data: klien tidak mengirim detak jantung terus-menerus; status dihitung dari aktivitas normal murid, jadi hemat kuota dan ramah sinyal lemah. Di server, kehadiran satu kelas disimpan sebagai satu hash Redis per kuis, sehingga setiap request murid hanya menulis satu medan miliknya sendiri — biayanya tidak tumbuh seiring jumlah anak di kelas, dan dua anak yang menyimpan jawaban bersamaan tidak saling menimpa. Monitor Ulangan (dulu bernama "Live Monitor") menampilkan siapa sedang mengerjakan apa, progres, dan catatan kejadian — mengalir tanpa muat ulang. Nama dan lencana jalur datanya diganti 12 Oktober 2026: layar guru tidak lagi memajang jargon teknis ("Langsung (SSE)" / "Polling 5 detik") karena yang penting bagi guru adalah papan pantauannya, bukan cara datanya datang; koneksi langsungnya tetap bekerja seperti semula.</w:t>
+        <w:t>bersifat tak bisa dihapus dan tak bisa diubah isinya). Panel di halaman koreksi hanya membaca. Saat menyala: menempel jawaban dari luar diblok dan dicatat, pindah tab dicatat satu kali per kepergian, buka layar penuh yang keluar diberi peringatan. Semua kejadian hanya **catatan untuk guru** — bukan hukuman otomatis. Presence bekerja hemat data: klien tidak mengirim detak jantung terus-menerus; status dihitung dari aktivitas normal murid, jadi hemat kuota dan ramah sinyal lemah. Di server, kehadiran satu kelas disimpan sebagai satu hash Redis per kuis, sehingga setiap request murid hanya menulis satu medan miliknya sendiri — biayanya tidak tumbuh seiring jumlah anak di kelas, dan dua anak yang menyimpan jawaban bersamaan tidak saling menimpa. Sejak 15 Oktober 2026 guru juga bisa **membuka jawaban tiap murid langsung dari Monitor Ulangan**: di tabel murid ada tombol "Lihat jawaban", dan panel yang muncul menampilkan satu baris per soal — nomor, tipe soal, teks soalnya, lalu apa yang ditulis anak itu (pilihan ganda dibaca sebagai "B. Benar", bukan "B" saja), plus nomor soal mana yang masih kosong. Isinya ikut hidup sendiri selama panelnya terbuka, jadi guru melihat tulisan anak bertambah tanpa memuat ulang halaman. Yang **tidak** ada di panel itu: kunci jawaban dan nilai per soal — layar monitor terbuka di depan kelas, sedangkan nilai per soal diubah lewat halaman koreksi manual supaya setiap perubahan tercatat. Batas bacanya sama dengan monitor: guru pemilik kuis dan kepala sekolah (keduanya boleh membaca keadaan kuis di sekolahnya), sedangkan guru lain dan murid ditolak.</w:t>
       </w:r>
     </w:p>
     <w:p>
       <w:r/>
     </w:p>
     <w:p>
+      <w:r>
+        <w:t>Monitor Ulangan (dulu bernama "Live Monitor") menampilkan siapa sedang mengerjakan apa, progres, dan catatan kejadian — mengalir tanpa muat ulang. Nama dan lencana jalur datanya diganti 12 Oktober 2026: layar guru tidak lagi memajang jargon teknis ("Langsung (SSE)" / "Polling 5 detik") karena yang penting bagi guru adalah papan pantauannya, bukan cara datanya datang; koneksi langsungnya tetap bekerja seperti semula.</w:t>
+      </w:r>
+    </w:p>
+    <w:p>
+      <w:r/>
+    </w:p>
+    <w:p>
       <w:pPr>
         <w:pStyle w:val="Heading3"/>
       </w:pPr>
@@ -5169,6 +5177,205 @@
     <w:p>
       <w:r>
         <w:t xml:space="preserve">   dilihat guru pemilik kuis di halaman kuis itu.</w:t>
+      </w:r>
+    </w:p>
+    <w:p>
+      <w:r/>
+    </w:p>
+    <w:p>
+      <w:pPr>
+        <w:pStyle w:val="Heading2"/>
+      </w:pPr>
+      <w:r>
+        <w:t>26. Materi contoh yang benar-benar bisa dipakai: Fotosintesis kelas 4 (15 Oktober 2026)</w:t>
+      </w:r>
+    </w:p>
+    <w:p>
+      <w:r/>
+    </w:p>
+    <w:p>
+      <w:pPr>
+        <w:pStyle w:val="Heading3"/>
+      </w:pPr>
+      <w:r>
+        <w:t>Apa ini</w:t>
+      </w:r>
+    </w:p>
+    <w:p>
+      <w:r/>
+    </w:p>
+    <w:p>
+      <w:r>
+        <w:t>Satu materi **IPA kelas 4** yang sudah jadi dan bisa dipakai murid hari itu juga — bukan contoh kosong dan bukan</w:t>
+      </w:r>
+    </w:p>
+    <w:p>
+      <w:r>
+        <w:t>bahan audit. Sumbernya satu video pelajaran sungguhan: *"PROSES FOTOSINTESIS PADA TUMBUHAN (KELAS 4 SD KURIKULUM</w:t>
+      </w:r>
+    </w:p>
+    <w:p>
+      <w:r>
+        <w:t>MERDEKA)"* dari kanal **Ratih Setyaningrum**, panjang **3 menit 5 detik** — videonya dipakai sebagai klip materi,</w:t>
+      </w:r>
+    </w:p>
+    <w:p>
+      <w:r>
+        <w:t>dengan kredit lengkap di keterangan klipnya.</w:t>
+      </w:r>
+    </w:p>
+    <w:p>
+      <w:r/>
+    </w:p>
+    <w:p>
+      <w:r>
+        <w:t>Materinya dijalankan sebagai **perjalanan Mendaki Gunung Fotosintesis**: enam pos, dari Basecamp sampai Puncak</w:t>
+      </w:r>
+    </w:p>
+    <w:p>
+      <w:r>
+        <w:t>(judul tema boleh diganti guru; pos-posnya punya nama pos yang bisa diubah).</w:t>
+      </w:r>
+    </w:p>
+    <w:p>
+      <w:r/>
+    </w:p>
+    <w:p>
+      <w:pPr>
+        <w:pStyle w:val="Heading3"/>
+      </w:pPr>
+      <w:r>
+        <w:t>Isinya</w:t>
+      </w:r>
+    </w:p>
+    <w:p>
+      <w:r/>
+    </w:p>
+    <w:p>
+      <w:pPr>
+        <w:pStyle w:val="ListBullet"/>
+      </w:pPr>
+      <w:r>
+        <w:t>**Empat kuis sungguhan**: tiga latihan yang muncul **di dalam video** (detik 40, 95, dan 150 — bahan, alat &amp;</w:t>
+      </w:r>
+    </w:p>
+    <w:p>
+      <w:r>
+        <w:t xml:space="preserve">  tempat kerja daun, lalu hasilnya) dan satu **ujian penutup** yang mulai tepat saat videonya habis.</w:t>
+      </w:r>
+    </w:p>
+    <w:p>
+      <w:pPr>
+        <w:pStyle w:val="ListBullet"/>
+      </w:pPr>
+      <w:r>
+        <w:t>**15 soal** yang ditulis untuk anak kelas 4, delapan tipe berbeda: pilihan ganda, benar/salah, isian singkat,</w:t>
+      </w:r>
+    </w:p>
+    <w:p>
+      <w:r>
+        <w:t xml:space="preserve">  menjodohkan, mengurutkan, letak kata, pilihan ganda kompleks ("pilih semua bahan"), dan klasifikasi</w:t>
+      </w:r>
+    </w:p>
+    <w:p>
+      <w:r>
+        <w:t xml:space="preserve">  (memilah bahan yang masuk vs hasil yang dibuat).</w:t>
+      </w:r>
+    </w:p>
+    <w:p>
+      <w:pPr>
+        <w:pStyle w:val="ListBullet"/>
+      </w:pPr>
+      <w:r>
+        <w:t>**Pembahasan guru untuk SETIAP soal.** Sesudah murid mengumpulkan latihan, kartu ingat di layarnya tidak hanya</w:t>
+      </w:r>
+    </w:p>
+    <w:p>
+      <w:r>
+        <w:t xml:space="preserve">  menampilkan jawaban benar, tetapi juga alasannya — misalnya kenapa cahaya matahari bukan "bahan" melainkan</w:t>
+      </w:r>
+    </w:p>
+    <w:p>
+      <w:r>
+        <w:t xml:space="preserve">  sumber energi, atau kenapa oksigen tidak termasuk bahan yang diserap. Tulisan guru di kolom pembahasan tidak</w:t>
+      </w:r>
+    </w:p>
+    <w:p>
+      <w:r>
+        <w:t xml:space="preserve">  pernah ditimpa bila seeder dijalankan ulang.</w:t>
+      </w:r>
+    </w:p>
+    <w:p>
+      <w:pPr>
+        <w:pStyle w:val="ListBullet"/>
+      </w:pPr>
+      <w:r>
+        <w:t>**Penjelasan sesudah tiap kuis** (ringkasan singkat yang muncul sebelum murid melanjutkan video), dan penutup</w:t>
+      </w:r>
+    </w:p>
+    <w:p>
+      <w:r>
+        <w:t xml:space="preserve">  berupa rumus inti + tantangan mengamati dua tanaman di rumah selama seminggu.</w:t>
+      </w:r>
+    </w:p>
+    <w:p>
+      <w:pPr>
+        <w:pStyle w:val="ListBullet"/>
+      </w:pPr>
+      <w:r>
+        <w:t>Satu **akun murid contoh** di kelas 4A supaya sisi anak bisa langsung dicoba.</w:t>
+      </w:r>
+    </w:p>
+    <w:p>
+      <w:r/>
+    </w:p>
+    <w:p>
+      <w:pPr>
+        <w:pStyle w:val="Heading3"/>
+      </w:pPr>
+      <w:r>
+        <w:t>Cara membukanya</w:t>
+      </w:r>
+    </w:p>
+    <w:p>
+      <w:r/>
+    </w:p>
+    <w:p>
+      <w:r>
+        <w:t>| Peran | Masuk sebagai | Yang dibuka |</w:t>
+      </w:r>
+    </w:p>
+    <w:p>
+      <w:r>
+        <w:t>| --- | --- | --- |</w:t>
+      </w:r>
+    </w:p>
+    <w:p>
+      <w:r>
+        <w:t>| Guru | `guru1@sekolah.test` / `password12` | Materi → **"Fotosintesis: Perjalanan Memasak Makanan di Daun"** (sudah **terbit**, kelas 4A) |</w:t>
+      </w:r>
+    </w:p>
+    <w:p>
+      <w:r>
+        <w:t>| Murid | `murid4a@sekolah.test` / `Passw0rd!Aman` | Beranda → Materi saya → perjalanan yang sama, dari Basecamp |</w:t>
+      </w:r>
+    </w:p>
+    <w:p>
+      <w:r/>
+    </w:p>
+    <w:p>
+      <w:r>
+        <w:t>Menyiapkan ulang di basis data mana pun: `php artisan db:seed --class=MateriContohSeeder` — idempoten, jadi boleh</w:t>
+      </w:r>
+    </w:p>
+    <w:p>
+      <w:r>
+        <w:t>dijalankan berulang tanpa menggandakan materi, kuis, atau soal. Seeder yang sama juga membersihkan kuis sisa</w:t>
+      </w:r>
+    </w:p>
+    <w:p>
+      <w:r>
+        <w:t>harness audit yang tidak dipakai blok mana pun dan belum pernah dikerjakan murid.</w:t>
       </w:r>
     </w:p>
     <w:sectPr>

</xml_diff>